<commit_message>
Bổ sung Công nghệ 4 HK1 (trọn năm 35 tiết) + Tiếng Việt 5 (Bài 26 T32, Tiết 6 T35, Đọc mở rộng T25)
- Công nghệ 4: nạp HK1 từ nguồn Cô Mai (tuần 1-19) -> CN4 đủ 35/35 tuần
- Tiếng Việt 5: bù Bài 26 "Những con hạc giấy" (T32), Tiết 6 ôn tập (T35), khôi phục Đọc mở rộng (T25)
- Kho 1342 -> 1366 tiết; KHGD Công nghệ 4 cập nhật trọn năm; cache-bust v20260626-cn4tv5

Co-Authored-By: Claude Opus 4.8 (1M context) <noreply@anthropic.com>
</commit_message>
<xml_diff>
--- a/khgd/KHGD_mon_Cong_nghe_4_2026_2027.docx
+++ b/khgd/KHGD_mon_Cong_nghe_4_2026_2027.docx
@@ -137,7 +137,7 @@
                 <w:sz w:val="20"/>
                 <w:szCs w:val="20"/>
               </w:rPr>
-              <w:t xml:space="preserve">HỌC KÌ II</w:t>
+              <w:t xml:space="preserve">HỌC KÌ I</w:t>
             </w:r>
           </w:p>
         </w:tc>
@@ -317,7 +317,7 @@
                 <w:sz w:val="18"/>
                 <w:szCs w:val="18"/>
               </w:rPr>
-              <w:t xml:space="preserve">20</w:t>
+              <w:t xml:space="preserve">1</w:t>
             </w:r>
           </w:p>
         </w:tc>
@@ -365,7 +365,7 @@
                 <w:sz w:val="18"/>
                 <w:szCs w:val="18"/>
               </w:rPr>
-              <w:t xml:space="preserve">Bài 6: Chăm sóc hoa, cây cảnh trong chậu</w:t>
+              <w:t xml:space="preserve">Bài 1: Lợi ích của hoa và cây cảnh (tiết 1)</w:t>
             </w:r>
           </w:p>
         </w:tc>
@@ -388,7 +388,7 @@
                 <w:sz w:val="18"/>
                 <w:szCs w:val="18"/>
               </w:rPr>
-              <w:t xml:space="preserve">1 tiết</w:t>
+              <w:t xml:space="preserve">3 tiết</w:t>
             </w:r>
           </w:p>
         </w:tc>
@@ -460,7 +460,7 @@
                 <w:sz w:val="18"/>
                 <w:szCs w:val="18"/>
               </w:rPr>
-              <w:t xml:space="preserve">21</w:t>
+              <w:t xml:space="preserve">2</w:t>
             </w:r>
           </w:p>
         </w:tc>
@@ -480,12 +480,10 @@
             <w:r>
               <w:rPr>
                 <w:rFonts w:ascii="Times New Roman" w:hAnsi="Times New Roman" w:eastAsia="Times New Roman"/>
-                <w:b/>
-                <w:color w:val="002060"/>
-                <w:sz w:val="18"/>
-                <w:szCs w:val="18"/>
-              </w:rPr>
-              <w:t xml:space="preserve">Chủ đề 2: THỦ CÔNG KĨ THUẬT</w:t>
+                <w:sz w:val="18"/>
+                <w:szCs w:val="18"/>
+              </w:rPr>
+              <w:t xml:space="preserve"/>
             </w:r>
           </w:p>
         </w:tc>
@@ -508,7 +506,7 @@
                 <w:sz w:val="18"/>
                 <w:szCs w:val="18"/>
               </w:rPr>
-              <w:t xml:space="preserve">Bài 7: Giới thiệu bộ lắp ghép mô hình kĩ thuật (tiết 1)</w:t>
+              <w:t xml:space="preserve">Bài 1: Lợi ích của hoa và cây cảnh (tiết 2)</w:t>
             </w:r>
           </w:p>
         </w:tc>
@@ -531,7 +529,7 @@
                 <w:sz w:val="18"/>
                 <w:szCs w:val="18"/>
               </w:rPr>
-              <w:t xml:space="preserve">2 tiết</w:t>
+              <w:t xml:space="preserve"/>
             </w:r>
           </w:p>
         </w:tc>
@@ -555,6 +553,286 @@
                 <w:szCs w:val="18"/>
               </w:rPr>
               <w:t xml:space="preserve">2</w:t>
+            </w:r>
+          </w:p>
+        </w:tc>
+        <w:tc>
+          <w:tcPr>
+            <w:tcW w:w="3100" w:type="dxa"/>
+            <w:tcBorders>
+              <w:bottom w:val="single" w:sz="8" w:space="0" w:color="000000"/>
+            </w:tcBorders>
+            <w:vAlign w:val="center"/>
+          </w:tcPr>
+          <w:p>
+            <w:pPr>
+              <w:jc w:val="left"/>
+              <w:spacing w:before="0" w:after="0" w:line="240" w:lineRule="auto"/>
+            </w:pPr>
+            <w:r>
+              <w:rPr>
+                <w:rFonts w:ascii="Times New Roman" w:hAnsi="Times New Roman" w:eastAsia="Times New Roman"/>
+                <w:sz w:val="17"/>
+                <w:szCs w:val="17"/>
+              </w:rPr>
+              <w:t xml:space="preserve"/>
+            </w:r>
+          </w:p>
+        </w:tc>
+      </w:tr>
+      <w:tr>
+        <w:tc>
+          <w:tcPr>
+            <w:tcW w:w="750" w:type="dxa"/>
+            <w:tcBorders>
+              <w:bottom w:val="single" w:sz="8" w:space="0" w:color="000000"/>
+            </w:tcBorders>
+            <w:vAlign w:val="center"/>
+          </w:tcPr>
+          <w:p>
+            <w:pPr>
+              <w:jc w:val="center"/>
+              <w:spacing w:before="0" w:after="0" w:line="240" w:lineRule="auto"/>
+            </w:pPr>
+            <w:r>
+              <w:rPr>
+                <w:rFonts w:ascii="Times New Roman" w:hAnsi="Times New Roman" w:eastAsia="Times New Roman"/>
+                <w:sz w:val="18"/>
+                <w:szCs w:val="18"/>
+              </w:rPr>
+              <w:t xml:space="preserve">3</w:t>
+            </w:r>
+          </w:p>
+        </w:tc>
+        <w:tc>
+          <w:tcPr>
+            <w:tcW w:w="2750" w:type="dxa"/>
+            <w:tcBorders>
+              <w:bottom w:val="single" w:sz="8" w:space="0" w:color="000000"/>
+            </w:tcBorders>
+            <w:vAlign w:val="center"/>
+          </w:tcPr>
+          <w:p>
+            <w:pPr>
+              <w:jc w:val="left"/>
+              <w:spacing w:before="0" w:after="0" w:line="240" w:lineRule="auto"/>
+            </w:pPr>
+            <w:r>
+              <w:rPr>
+                <w:rFonts w:ascii="Times New Roman" w:hAnsi="Times New Roman" w:eastAsia="Times New Roman"/>
+                <w:sz w:val="18"/>
+                <w:szCs w:val="18"/>
+              </w:rPr>
+              <w:t xml:space="preserve"/>
+            </w:r>
+          </w:p>
+        </w:tc>
+        <w:tc>
+          <w:tcPr>
+            <w:tcW w:w="5550" w:type="dxa"/>
+            <w:tcBorders>
+              <w:bottom w:val="single" w:sz="8" w:space="0" w:color="000000"/>
+            </w:tcBorders>
+            <w:vAlign w:val="center"/>
+          </w:tcPr>
+          <w:p>
+            <w:pPr>
+              <w:jc w:val="left"/>
+              <w:spacing w:before="0" w:after="0" w:line="240" w:lineRule="auto"/>
+            </w:pPr>
+            <w:r>
+              <w:rPr>
+                <w:rFonts w:ascii="Times New Roman" w:hAnsi="Times New Roman" w:eastAsia="Times New Roman"/>
+                <w:sz w:val="18"/>
+                <w:szCs w:val="18"/>
+              </w:rPr>
+              <w:t xml:space="preserve">Bài 1: Lợi ích của hoa và cây cảnh (tiết 3)</w:t>
+            </w:r>
+          </w:p>
+        </w:tc>
+        <w:tc>
+          <w:tcPr>
+            <w:tcW w:w="1150" w:type="dxa"/>
+            <w:tcBorders>
+              <w:bottom w:val="single" w:sz="8" w:space="0" w:color="000000"/>
+            </w:tcBorders>
+            <w:vAlign w:val="center"/>
+          </w:tcPr>
+          <w:p>
+            <w:pPr>
+              <w:jc w:val="center"/>
+              <w:spacing w:before="0" w:after="0" w:line="240" w:lineRule="auto"/>
+            </w:pPr>
+            <w:r>
+              <w:rPr>
+                <w:rFonts w:ascii="Times New Roman" w:hAnsi="Times New Roman" w:eastAsia="Times New Roman"/>
+                <w:sz w:val="18"/>
+                <w:szCs w:val="18"/>
+              </w:rPr>
+              <w:t xml:space="preserve"/>
+            </w:r>
+          </w:p>
+        </w:tc>
+        <w:tc>
+          <w:tcPr>
+            <w:tcW w:w="1100" w:type="dxa"/>
+            <w:tcBorders>
+              <w:bottom w:val="single" w:sz="8" w:space="0" w:color="000000"/>
+            </w:tcBorders>
+            <w:vAlign w:val="center"/>
+          </w:tcPr>
+          <w:p>
+            <w:pPr>
+              <w:jc w:val="center"/>
+              <w:spacing w:before="0" w:after="0" w:line="240" w:lineRule="auto"/>
+            </w:pPr>
+            <w:r>
+              <w:rPr>
+                <w:rFonts w:ascii="Times New Roman" w:hAnsi="Times New Roman" w:eastAsia="Times New Roman"/>
+                <w:sz w:val="18"/>
+                <w:szCs w:val="18"/>
+              </w:rPr>
+              <w:t xml:space="preserve">3</w:t>
+            </w:r>
+          </w:p>
+        </w:tc>
+        <w:tc>
+          <w:tcPr>
+            <w:tcW w:w="3100" w:type="dxa"/>
+            <w:tcBorders>
+              <w:bottom w:val="single" w:sz="8" w:space="0" w:color="000000"/>
+            </w:tcBorders>
+            <w:vAlign w:val="center"/>
+          </w:tcPr>
+          <w:p>
+            <w:pPr>
+              <w:jc w:val="left"/>
+              <w:spacing w:before="0" w:after="0" w:line="240" w:lineRule="auto"/>
+            </w:pPr>
+            <w:r>
+              <w:rPr>
+                <w:rFonts w:ascii="Times New Roman" w:hAnsi="Times New Roman" w:eastAsia="Times New Roman"/>
+                <w:sz w:val="17"/>
+                <w:szCs w:val="17"/>
+              </w:rPr>
+              <w:t xml:space="preserve"/>
+            </w:r>
+          </w:p>
+        </w:tc>
+      </w:tr>
+      <w:tr>
+        <w:tc>
+          <w:tcPr>
+            <w:tcW w:w="750" w:type="dxa"/>
+            <w:tcBorders>
+              <w:bottom w:val="single" w:sz="8" w:space="0" w:color="000000"/>
+            </w:tcBorders>
+            <w:vAlign w:val="center"/>
+          </w:tcPr>
+          <w:p>
+            <w:pPr>
+              <w:jc w:val="center"/>
+              <w:spacing w:before="0" w:after="0" w:line="240" w:lineRule="auto"/>
+            </w:pPr>
+            <w:r>
+              <w:rPr>
+                <w:rFonts w:ascii="Times New Roman" w:hAnsi="Times New Roman" w:eastAsia="Times New Roman"/>
+                <w:sz w:val="18"/>
+                <w:szCs w:val="18"/>
+              </w:rPr>
+              <w:t xml:space="preserve">4</w:t>
+            </w:r>
+          </w:p>
+        </w:tc>
+        <w:tc>
+          <w:tcPr>
+            <w:tcW w:w="2750" w:type="dxa"/>
+            <w:tcBorders>
+              <w:bottom w:val="single" w:sz="8" w:space="0" w:color="000000"/>
+            </w:tcBorders>
+            <w:vAlign w:val="center"/>
+          </w:tcPr>
+          <w:p>
+            <w:pPr>
+              <w:jc w:val="left"/>
+              <w:spacing w:before="0" w:after="0" w:line="240" w:lineRule="auto"/>
+            </w:pPr>
+            <w:r>
+              <w:rPr>
+                <w:rFonts w:ascii="Times New Roman" w:hAnsi="Times New Roman" w:eastAsia="Times New Roman"/>
+                <w:sz w:val="18"/>
+                <w:szCs w:val="18"/>
+              </w:rPr>
+              <w:t xml:space="preserve"/>
+            </w:r>
+          </w:p>
+        </w:tc>
+        <w:tc>
+          <w:tcPr>
+            <w:tcW w:w="5550" w:type="dxa"/>
+            <w:tcBorders>
+              <w:bottom w:val="single" w:sz="8" w:space="0" w:color="000000"/>
+            </w:tcBorders>
+            <w:vAlign w:val="center"/>
+          </w:tcPr>
+          <w:p>
+            <w:pPr>
+              <w:jc w:val="left"/>
+              <w:spacing w:before="0" w:after="0" w:line="240" w:lineRule="auto"/>
+            </w:pPr>
+            <w:r>
+              <w:rPr>
+                <w:rFonts w:ascii="Times New Roman" w:hAnsi="Times New Roman" w:eastAsia="Times New Roman"/>
+                <w:sz w:val="18"/>
+                <w:szCs w:val="18"/>
+              </w:rPr>
+              <w:t xml:space="preserve">Bài 2: Một số loại hoa, cây cảnh phổ biến (tiết 1)</w:t>
+            </w:r>
+          </w:p>
+        </w:tc>
+        <w:tc>
+          <w:tcPr>
+            <w:tcW w:w="1150" w:type="dxa"/>
+            <w:tcBorders>
+              <w:bottom w:val="single" w:sz="8" w:space="0" w:color="000000"/>
+            </w:tcBorders>
+            <w:vAlign w:val="center"/>
+          </w:tcPr>
+          <w:p>
+            <w:pPr>
+              <w:jc w:val="center"/>
+              <w:spacing w:before="0" w:after="0" w:line="240" w:lineRule="auto"/>
+            </w:pPr>
+            <w:r>
+              <w:rPr>
+                <w:rFonts w:ascii="Times New Roman" w:hAnsi="Times New Roman" w:eastAsia="Times New Roman"/>
+                <w:sz w:val="18"/>
+                <w:szCs w:val="18"/>
+              </w:rPr>
+              <w:t xml:space="preserve">3 tiết</w:t>
+            </w:r>
+          </w:p>
+        </w:tc>
+        <w:tc>
+          <w:tcPr>
+            <w:tcW w:w="1100" w:type="dxa"/>
+            <w:tcBorders>
+              <w:bottom w:val="single" w:sz="8" w:space="0" w:color="000000"/>
+            </w:tcBorders>
+            <w:vAlign w:val="center"/>
+          </w:tcPr>
+          <w:p>
+            <w:pPr>
+              <w:jc w:val="center"/>
+              <w:spacing w:before="0" w:after="0" w:line="240" w:lineRule="auto"/>
+            </w:pPr>
+            <w:r>
+              <w:rPr>
+                <w:rFonts w:ascii="Times New Roman" w:hAnsi="Times New Roman" w:eastAsia="Times New Roman"/>
+                <w:sz w:val="18"/>
+                <w:szCs w:val="18"/>
+              </w:rPr>
+              <w:t xml:space="preserve">4</w:t>
             </w:r>
           </w:p>
         </w:tc>
@@ -578,7 +856,7 @@
                 <w:sz w:val="17"/>
                 <w:szCs w:val="17"/>
               </w:rPr>
-              <w:t xml:space="preserve">GD STEM; NLS-ST: Tìm tư liệu, xem video hướng dẫn kĩ thuật; tạo sản phẩm và chụp/quay lại quá trình (có hướng dẫn).</w:t>
+              <w:t xml:space="preserve">NLS-KT: Quan sát hình ảnh/video kĩ thuật, khai thác thông tin an toàn lao động (có hướng dẫn).</w:t>
             </w:r>
           </w:p>
         </w:tc>
@@ -603,7 +881,7 @@
                 <w:sz w:val="18"/>
                 <w:szCs w:val="18"/>
               </w:rPr>
-              <w:t xml:space="preserve">22</w:t>
+              <w:t xml:space="preserve">5</w:t>
             </w:r>
           </w:p>
         </w:tc>
@@ -649,7 +927,7 @@
                 <w:sz w:val="18"/>
                 <w:szCs w:val="18"/>
               </w:rPr>
-              <w:t xml:space="preserve">Bài 7: Giới thiệu bộ lắp ghép mô hình kĩ thuật (tiết 2)</w:t>
+              <w:t xml:space="preserve">Bài 2: Một số loại hoa, cây cảnh phổ biến (tiết 2)</w:t>
             </w:r>
           </w:p>
         </w:tc>
@@ -695,7 +973,7 @@
                 <w:sz w:val="18"/>
                 <w:szCs w:val="18"/>
               </w:rPr>
-              <w:t xml:space="preserve">3</w:t>
+              <w:t xml:space="preserve">5</w:t>
             </w:r>
           </w:p>
         </w:tc>
@@ -743,7 +1021,7 @@
                 <w:sz w:val="18"/>
                 <w:szCs w:val="18"/>
               </w:rPr>
-              <w:t xml:space="preserve">23</w:t>
+              <w:t xml:space="preserve">6</w:t>
             </w:r>
           </w:p>
         </w:tc>
@@ -789,7 +1067,7 @@
                 <w:sz w:val="18"/>
                 <w:szCs w:val="18"/>
               </w:rPr>
-              <w:t xml:space="preserve">Bài 8: Lắp ghép mô hình bập bênh (tiết 1)</w:t>
+              <w:t xml:space="preserve">Bài 2: Một số loài hoa, cây cảnh phổ biến (tiết 3)</w:t>
             </w:r>
           </w:p>
         </w:tc>
@@ -812,7 +1090,7 @@
                 <w:sz w:val="18"/>
                 <w:szCs w:val="18"/>
               </w:rPr>
-              <w:t xml:space="preserve">2 tiết</w:t>
+              <w:t xml:space="preserve"/>
             </w:r>
           </w:p>
         </w:tc>
@@ -835,7 +1113,147 @@
                 <w:sz w:val="18"/>
                 <w:szCs w:val="18"/>
               </w:rPr>
-              <w:t xml:space="preserve">4</w:t>
+              <w:t xml:space="preserve">6</w:t>
+            </w:r>
+          </w:p>
+        </w:tc>
+        <w:tc>
+          <w:tcPr>
+            <w:tcW w:w="3100" w:type="dxa"/>
+            <w:tcBorders>
+              <w:bottom w:val="single" w:sz="8" w:space="0" w:color="000000"/>
+            </w:tcBorders>
+            <w:vAlign w:val="center"/>
+          </w:tcPr>
+          <w:p>
+            <w:pPr>
+              <w:jc w:val="left"/>
+              <w:spacing w:before="0" w:after="0" w:line="240" w:lineRule="auto"/>
+            </w:pPr>
+            <w:r>
+              <w:rPr>
+                <w:rFonts w:ascii="Times New Roman" w:hAnsi="Times New Roman" w:eastAsia="Times New Roman"/>
+                <w:sz w:val="17"/>
+                <w:szCs w:val="17"/>
+              </w:rPr>
+              <w:t xml:space="preserve"/>
+            </w:r>
+          </w:p>
+        </w:tc>
+      </w:tr>
+      <w:tr>
+        <w:tc>
+          <w:tcPr>
+            <w:tcW w:w="750" w:type="dxa"/>
+            <w:tcBorders>
+              <w:bottom w:val="single" w:sz="8" w:space="0" w:color="000000"/>
+            </w:tcBorders>
+            <w:vAlign w:val="center"/>
+          </w:tcPr>
+          <w:p>
+            <w:pPr>
+              <w:jc w:val="center"/>
+              <w:spacing w:before="0" w:after="0" w:line="240" w:lineRule="auto"/>
+            </w:pPr>
+            <w:r>
+              <w:rPr>
+                <w:rFonts w:ascii="Times New Roman" w:hAnsi="Times New Roman" w:eastAsia="Times New Roman"/>
+                <w:sz w:val="18"/>
+                <w:szCs w:val="18"/>
+              </w:rPr>
+              <w:t xml:space="preserve">7</w:t>
+            </w:r>
+          </w:p>
+        </w:tc>
+        <w:tc>
+          <w:tcPr>
+            <w:tcW w:w="2750" w:type="dxa"/>
+            <w:tcBorders>
+              <w:bottom w:val="single" w:sz="8" w:space="0" w:color="000000"/>
+            </w:tcBorders>
+            <w:vAlign w:val="center"/>
+          </w:tcPr>
+          <w:p>
+            <w:pPr>
+              <w:jc w:val="left"/>
+              <w:spacing w:before="0" w:after="0" w:line="240" w:lineRule="auto"/>
+            </w:pPr>
+            <w:r>
+              <w:rPr>
+                <w:rFonts w:ascii="Times New Roman" w:hAnsi="Times New Roman" w:eastAsia="Times New Roman"/>
+                <w:sz w:val="18"/>
+                <w:szCs w:val="18"/>
+              </w:rPr>
+              <w:t xml:space="preserve"/>
+            </w:r>
+          </w:p>
+        </w:tc>
+        <w:tc>
+          <w:tcPr>
+            <w:tcW w:w="5550" w:type="dxa"/>
+            <w:tcBorders>
+              <w:bottom w:val="single" w:sz="8" w:space="0" w:color="000000"/>
+            </w:tcBorders>
+            <w:vAlign w:val="center"/>
+          </w:tcPr>
+          <w:p>
+            <w:pPr>
+              <w:jc w:val="left"/>
+              <w:spacing w:before="0" w:after="0" w:line="240" w:lineRule="auto"/>
+            </w:pPr>
+            <w:r>
+              <w:rPr>
+                <w:rFonts w:ascii="Times New Roman" w:hAnsi="Times New Roman" w:eastAsia="Times New Roman"/>
+                <w:sz w:val="18"/>
+                <w:szCs w:val="18"/>
+              </w:rPr>
+              <w:t xml:space="preserve">Bài 3: Vật liệu và dụng cụ tròng hoa, cây cảnh trong chậu (tiết 1)</w:t>
+            </w:r>
+          </w:p>
+        </w:tc>
+        <w:tc>
+          <w:tcPr>
+            <w:tcW w:w="1150" w:type="dxa"/>
+            <w:tcBorders>
+              <w:bottom w:val="single" w:sz="8" w:space="0" w:color="000000"/>
+            </w:tcBorders>
+            <w:vAlign w:val="center"/>
+          </w:tcPr>
+          <w:p>
+            <w:pPr>
+              <w:jc w:val="center"/>
+              <w:spacing w:before="0" w:after="0" w:line="240" w:lineRule="auto"/>
+            </w:pPr>
+            <w:r>
+              <w:rPr>
+                <w:rFonts w:ascii="Times New Roman" w:hAnsi="Times New Roman" w:eastAsia="Times New Roman"/>
+                <w:sz w:val="18"/>
+                <w:szCs w:val="18"/>
+              </w:rPr>
+              <w:t xml:space="preserve">3 tiết</w:t>
+            </w:r>
+          </w:p>
+        </w:tc>
+        <w:tc>
+          <w:tcPr>
+            <w:tcW w:w="1100" w:type="dxa"/>
+            <w:tcBorders>
+              <w:bottom w:val="single" w:sz="8" w:space="0" w:color="000000"/>
+            </w:tcBorders>
+            <w:vAlign w:val="center"/>
+          </w:tcPr>
+          <w:p>
+            <w:pPr>
+              <w:jc w:val="center"/>
+              <w:spacing w:before="0" w:after="0" w:line="240" w:lineRule="auto"/>
+            </w:pPr>
+            <w:r>
+              <w:rPr>
+                <w:rFonts w:ascii="Times New Roman" w:hAnsi="Times New Roman" w:eastAsia="Times New Roman"/>
+                <w:sz w:val="18"/>
+                <w:szCs w:val="18"/>
+              </w:rPr>
+              <w:t xml:space="preserve">7</w:t>
             </w:r>
           </w:p>
         </w:tc>
@@ -859,7 +1277,7 @@
                 <w:sz w:val="17"/>
                 <w:szCs w:val="17"/>
               </w:rPr>
-              <w:t xml:space="preserve">GD STEM; NLS-ST: Tìm tư liệu, xem video hướng dẫn kĩ thuật; tạo sản phẩm và chụp/quay lại quá trình (có hướng dẫn).</w:t>
+              <w:t xml:space="preserve">NLS-KT: Quan sát hình ảnh/video kĩ thuật, khai thác thông tin an toàn lao động (có hướng dẫn).</w:t>
             </w:r>
           </w:p>
         </w:tc>
@@ -884,7 +1302,7 @@
                 <w:sz w:val="18"/>
                 <w:szCs w:val="18"/>
               </w:rPr>
-              <w:t xml:space="preserve">24</w:t>
+              <w:t xml:space="preserve">8</w:t>
             </w:r>
           </w:p>
         </w:tc>
@@ -930,7 +1348,7 @@
                 <w:sz w:val="18"/>
                 <w:szCs w:val="18"/>
               </w:rPr>
-              <w:t xml:space="preserve">Bài 8: Lắp ghép mô hình bập bênh (tiết 2)</w:t>
+              <w:t xml:space="preserve">Bài 3: Vật liệu và dụng cụ tròng hoa, cây cảnh trong chậu (tiết 2)</w:t>
             </w:r>
           </w:p>
         </w:tc>
@@ -976,7 +1394,7 @@
                 <w:sz w:val="18"/>
                 <w:szCs w:val="18"/>
               </w:rPr>
-              <w:t xml:space="preserve">5</w:t>
+              <w:t xml:space="preserve">8</w:t>
             </w:r>
           </w:p>
         </w:tc>
@@ -1024,7 +1442,7 @@
                 <w:sz w:val="18"/>
                 <w:szCs w:val="18"/>
               </w:rPr>
-              <w:t xml:space="preserve">25</w:t>
+              <w:t xml:space="preserve">9</w:t>
             </w:r>
           </w:p>
         </w:tc>
@@ -1070,7 +1488,7 @@
                 <w:sz w:val="18"/>
                 <w:szCs w:val="18"/>
               </w:rPr>
-              <w:t xml:space="preserve">Bài 9: Lắp ghép mô hình rô-bốt (tiết 1)</w:t>
+              <w:t xml:space="preserve">Bài 3: Vật liệu và dụng cụ trồng hoa, cây cảnh trong chậu (tiết 3)</w:t>
             </w:r>
           </w:p>
         </w:tc>
@@ -1093,6 +1511,146 @@
                 <w:sz w:val="18"/>
                 <w:szCs w:val="18"/>
               </w:rPr>
+              <w:t xml:space="preserve"/>
+            </w:r>
+          </w:p>
+        </w:tc>
+        <w:tc>
+          <w:tcPr>
+            <w:tcW w:w="1100" w:type="dxa"/>
+            <w:tcBorders>
+              <w:bottom w:val="single" w:sz="8" w:space="0" w:color="000000"/>
+            </w:tcBorders>
+            <w:vAlign w:val="center"/>
+          </w:tcPr>
+          <w:p>
+            <w:pPr>
+              <w:jc w:val="center"/>
+              <w:spacing w:before="0" w:after="0" w:line="240" w:lineRule="auto"/>
+            </w:pPr>
+            <w:r>
+              <w:rPr>
+                <w:rFonts w:ascii="Times New Roman" w:hAnsi="Times New Roman" w:eastAsia="Times New Roman"/>
+                <w:sz w:val="18"/>
+                <w:szCs w:val="18"/>
+              </w:rPr>
+              <w:t xml:space="preserve">9</w:t>
+            </w:r>
+          </w:p>
+        </w:tc>
+        <w:tc>
+          <w:tcPr>
+            <w:tcW w:w="3100" w:type="dxa"/>
+            <w:tcBorders>
+              <w:bottom w:val="single" w:sz="8" w:space="0" w:color="000000"/>
+            </w:tcBorders>
+            <w:vAlign w:val="center"/>
+          </w:tcPr>
+          <w:p>
+            <w:pPr>
+              <w:jc w:val="left"/>
+              <w:spacing w:before="0" w:after="0" w:line="240" w:lineRule="auto"/>
+            </w:pPr>
+            <w:r>
+              <w:rPr>
+                <w:rFonts w:ascii="Times New Roman" w:hAnsi="Times New Roman" w:eastAsia="Times New Roman"/>
+                <w:sz w:val="17"/>
+                <w:szCs w:val="17"/>
+              </w:rPr>
+              <w:t xml:space="preserve"/>
+            </w:r>
+          </w:p>
+        </w:tc>
+      </w:tr>
+      <w:tr>
+        <w:tc>
+          <w:tcPr>
+            <w:tcW w:w="750" w:type="dxa"/>
+            <w:tcBorders>
+              <w:bottom w:val="single" w:sz="8" w:space="0" w:color="000000"/>
+            </w:tcBorders>
+            <w:vAlign w:val="center"/>
+          </w:tcPr>
+          <w:p>
+            <w:pPr>
+              <w:jc w:val="center"/>
+              <w:spacing w:before="0" w:after="0" w:line="240" w:lineRule="auto"/>
+            </w:pPr>
+            <w:r>
+              <w:rPr>
+                <w:rFonts w:ascii="Times New Roman" w:hAnsi="Times New Roman" w:eastAsia="Times New Roman"/>
+                <w:sz w:val="18"/>
+                <w:szCs w:val="18"/>
+              </w:rPr>
+              <w:t xml:space="preserve">10</w:t>
+            </w:r>
+          </w:p>
+        </w:tc>
+        <w:tc>
+          <w:tcPr>
+            <w:tcW w:w="2750" w:type="dxa"/>
+            <w:tcBorders>
+              <w:bottom w:val="single" w:sz="8" w:space="0" w:color="000000"/>
+            </w:tcBorders>
+            <w:vAlign w:val="center"/>
+          </w:tcPr>
+          <w:p>
+            <w:pPr>
+              <w:jc w:val="left"/>
+              <w:spacing w:before="0" w:after="0" w:line="240" w:lineRule="auto"/>
+            </w:pPr>
+            <w:r>
+              <w:rPr>
+                <w:rFonts w:ascii="Times New Roman" w:hAnsi="Times New Roman" w:eastAsia="Times New Roman"/>
+                <w:sz w:val="18"/>
+                <w:szCs w:val="18"/>
+              </w:rPr>
+              <w:t xml:space="preserve"/>
+            </w:r>
+          </w:p>
+        </w:tc>
+        <w:tc>
+          <w:tcPr>
+            <w:tcW w:w="5550" w:type="dxa"/>
+            <w:tcBorders>
+              <w:bottom w:val="single" w:sz="8" w:space="0" w:color="000000"/>
+            </w:tcBorders>
+            <w:vAlign w:val="center"/>
+          </w:tcPr>
+          <w:p>
+            <w:pPr>
+              <w:jc w:val="left"/>
+              <w:spacing w:before="0" w:after="0" w:line="240" w:lineRule="auto"/>
+            </w:pPr>
+            <w:r>
+              <w:rPr>
+                <w:rFonts w:ascii="Times New Roman" w:hAnsi="Times New Roman" w:eastAsia="Times New Roman"/>
+                <w:sz w:val="18"/>
+                <w:szCs w:val="18"/>
+              </w:rPr>
+              <w:t xml:space="preserve">Bài 4: Gieo hạt hoa, cây cảnh trong chậu (tiết 1)</w:t>
+            </w:r>
+          </w:p>
+        </w:tc>
+        <w:tc>
+          <w:tcPr>
+            <w:tcW w:w="1150" w:type="dxa"/>
+            <w:tcBorders>
+              <w:bottom w:val="single" w:sz="8" w:space="0" w:color="000000"/>
+            </w:tcBorders>
+            <w:vAlign w:val="center"/>
+          </w:tcPr>
+          <w:p>
+            <w:pPr>
+              <w:jc w:val="center"/>
+              <w:spacing w:before="0" w:after="0" w:line="240" w:lineRule="auto"/>
+            </w:pPr>
+            <w:r>
+              <w:rPr>
+                <w:rFonts w:ascii="Times New Roman" w:hAnsi="Times New Roman" w:eastAsia="Times New Roman"/>
+                <w:sz w:val="18"/>
+                <w:szCs w:val="18"/>
+              </w:rPr>
               <w:t xml:space="preserve">3 tiết</w:t>
             </w:r>
           </w:p>
@@ -1116,7 +1674,7 @@
                 <w:sz w:val="18"/>
                 <w:szCs w:val="18"/>
               </w:rPr>
-              <w:t xml:space="preserve">6</w:t>
+              <w:t xml:space="preserve">10</w:t>
             </w:r>
           </w:p>
         </w:tc>
@@ -1140,7 +1698,7 @@
                 <w:sz w:val="17"/>
                 <w:szCs w:val="17"/>
               </w:rPr>
-              <w:t xml:space="preserve">GD STEM; NLS-ST: Tìm tư liệu, xem video hướng dẫn kĩ thuật; tạo sản phẩm và chụp/quay lại quá trình (có hướng dẫn).</w:t>
+              <w:t xml:space="preserve">NLS-KT: Quan sát hình ảnh/video kĩ thuật, khai thác thông tin an toàn lao động (có hướng dẫn).</w:t>
             </w:r>
           </w:p>
         </w:tc>
@@ -1165,7 +1723,7 @@
                 <w:sz w:val="18"/>
                 <w:szCs w:val="18"/>
               </w:rPr>
-              <w:t xml:space="preserve">26</w:t>
+              <w:t xml:space="preserve">11</w:t>
             </w:r>
           </w:p>
         </w:tc>
@@ -1211,7 +1769,7 @@
                 <w:sz w:val="18"/>
                 <w:szCs w:val="18"/>
               </w:rPr>
-              <w:t xml:space="preserve">Bài 9: Lắp ghép mô hình rô-bốt (tiết 2)</w:t>
+              <w:t xml:space="preserve">Bài 4: Gieo hạt hoa, cây cảnh trong chậu (tiết 2)</w:t>
             </w:r>
           </w:p>
         </w:tc>
@@ -1257,7 +1815,7 @@
                 <w:sz w:val="18"/>
                 <w:szCs w:val="18"/>
               </w:rPr>
-              <w:t xml:space="preserve">7</w:t>
+              <w:t xml:space="preserve">11</w:t>
             </w:r>
           </w:p>
         </w:tc>
@@ -1305,7 +1863,7 @@
                 <w:sz w:val="18"/>
                 <w:szCs w:val="18"/>
               </w:rPr>
-              <w:t xml:space="preserve">27</w:t>
+              <w:t xml:space="preserve">12</w:t>
             </w:r>
           </w:p>
         </w:tc>
@@ -1351,7 +1909,7 @@
                 <w:sz w:val="18"/>
                 <w:szCs w:val="18"/>
               </w:rPr>
-              <w:t xml:space="preserve">Bài 9: Lắp ghép mô hình rô-bốt (tiết 3)</w:t>
+              <w:t xml:space="preserve">Bài 4: Gieo hạt hoa, cây cảnh trong chậu (tiết 3)</w:t>
             </w:r>
           </w:p>
         </w:tc>
@@ -1397,7 +1955,7 @@
                 <w:sz w:val="18"/>
                 <w:szCs w:val="18"/>
               </w:rPr>
-              <w:t xml:space="preserve">8</w:t>
+              <w:t xml:space="preserve">12</w:t>
             </w:r>
           </w:p>
         </w:tc>
@@ -1445,7 +2003,7 @@
                 <w:sz w:val="18"/>
                 <w:szCs w:val="18"/>
               </w:rPr>
-              <w:t xml:space="preserve">28</w:t>
+              <w:t xml:space="preserve">13</w:t>
             </w:r>
           </w:p>
         </w:tc>
@@ -1491,7 +2049,7 @@
                 <w:sz w:val="18"/>
                 <w:szCs w:val="18"/>
               </w:rPr>
-              <w:t xml:space="preserve">Bài 10: Đồ chơi dân gian (tiết 1)</w:t>
+              <w:t xml:space="preserve">Bài 5: Chậu hoa và cây cảnh mini (tiết 1)</w:t>
             </w:r>
           </w:p>
         </w:tc>
@@ -1537,7 +2095,7 @@
                 <w:sz w:val="18"/>
                 <w:szCs w:val="18"/>
               </w:rPr>
-              <w:t xml:space="preserve">9</w:t>
+              <w:t xml:space="preserve">13</w:t>
             </w:r>
           </w:p>
         </w:tc>
@@ -1561,7 +2119,7 @@
                 <w:sz w:val="17"/>
                 <w:szCs w:val="17"/>
               </w:rPr>
-              <w:t xml:space="preserve">GD STEM; NLS-ST: Tìm tư liệu, xem video hướng dẫn kĩ thuật; tạo sản phẩm và chụp/quay lại quá trình (có hướng dẫn).</w:t>
+              <w:t xml:space="preserve">NLS-KT: Quan sát hình ảnh/video kĩ thuật, khai thác thông tin an toàn lao động (có hướng dẫn).</w:t>
             </w:r>
           </w:p>
         </w:tc>
@@ -1586,7 +2144,7 @@
                 <w:sz w:val="18"/>
                 <w:szCs w:val="18"/>
               </w:rPr>
-              <w:t xml:space="preserve">29</w:t>
+              <w:t xml:space="preserve">14</w:t>
             </w:r>
           </w:p>
         </w:tc>
@@ -1632,7 +2190,7 @@
                 <w:sz w:val="18"/>
                 <w:szCs w:val="18"/>
               </w:rPr>
-              <w:t xml:space="preserve">Bài 10: Đồ chơi dân gian (tiết 2)</w:t>
+              <w:t xml:space="preserve">Bài 5: Chậu hoa và cây cảnh mini (tiết 2)</w:t>
             </w:r>
           </w:p>
         </w:tc>
@@ -1678,7 +2236,7 @@
                 <w:sz w:val="18"/>
                 <w:szCs w:val="18"/>
               </w:rPr>
-              <w:t xml:space="preserve">10</w:t>
+              <w:t xml:space="preserve">14</w:t>
             </w:r>
           </w:p>
         </w:tc>
@@ -1726,7 +2284,7 @@
                 <w:sz w:val="18"/>
                 <w:szCs w:val="18"/>
               </w:rPr>
-              <w:t xml:space="preserve">30</w:t>
+              <w:t xml:space="preserve">15</w:t>
             </w:r>
           </w:p>
         </w:tc>
@@ -1772,7 +2330,7 @@
                 <w:sz w:val="18"/>
                 <w:szCs w:val="18"/>
               </w:rPr>
-              <w:t xml:space="preserve">Bài 10: Đồ chơi dân gian (tiết 3)</w:t>
+              <w:t xml:space="preserve">Bài 5: Chậu hoa và cây cảnh mini (tiết 3)</w:t>
             </w:r>
           </w:p>
         </w:tc>
@@ -1818,7 +2376,7 @@
                 <w:sz w:val="18"/>
                 <w:szCs w:val="18"/>
               </w:rPr>
-              <w:t xml:space="preserve">11</w:t>
+              <w:t xml:space="preserve">15</w:t>
             </w:r>
           </w:p>
         </w:tc>
@@ -1866,7 +2424,7 @@
                 <w:sz w:val="18"/>
                 <w:szCs w:val="18"/>
               </w:rPr>
-              <w:t xml:space="preserve">31</w:t>
+              <w:t xml:space="preserve">16</w:t>
             </w:r>
           </w:p>
         </w:tc>
@@ -1912,7 +2470,7 @@
                 <w:sz w:val="18"/>
                 <w:szCs w:val="18"/>
               </w:rPr>
-              <w:t xml:space="preserve">Bài 11: Làm đèn lồng</w:t>
+              <w:t xml:space="preserve">Bài 6: Chăm sóc hoa, cây cảnh trong chậu (tiết 1)</w:t>
             </w:r>
           </w:p>
         </w:tc>
@@ -1935,7 +2493,7 @@
                 <w:sz w:val="18"/>
                 <w:szCs w:val="18"/>
               </w:rPr>
-              <w:t xml:space="preserve">1 tiết</w:t>
+              <w:t xml:space="preserve">3 tiết</w:t>
             </w:r>
           </w:p>
         </w:tc>
@@ -1958,7 +2516,7 @@
                 <w:sz w:val="18"/>
                 <w:szCs w:val="18"/>
               </w:rPr>
-              <w:t xml:space="preserve">12</w:t>
+              <w:t xml:space="preserve">16</w:t>
             </w:r>
           </w:p>
         </w:tc>
@@ -1982,7 +2540,7 @@
                 <w:sz w:val="17"/>
                 <w:szCs w:val="17"/>
               </w:rPr>
-              <w:t xml:space="preserve">GD STEM; NLS-ST: Tìm tư liệu, xem video hướng dẫn kĩ thuật; tạo sản phẩm và chụp/quay lại quá trình (có hướng dẫn).</w:t>
+              <w:t xml:space="preserve">NLS-KT: Quan sát hình ảnh/video kĩ thuật, khai thác thông tin an toàn lao động (có hướng dẫn).</w:t>
             </w:r>
           </w:p>
         </w:tc>
@@ -2007,7 +2565,7 @@
                 <w:sz w:val="18"/>
                 <w:szCs w:val="18"/>
               </w:rPr>
-              <w:t xml:space="preserve">32</w:t>
+              <w:t xml:space="preserve">17</w:t>
             </w:r>
           </w:p>
         </w:tc>
@@ -2053,7 +2611,7 @@
                 <w:sz w:val="18"/>
                 <w:szCs w:val="18"/>
               </w:rPr>
-              <w:t xml:space="preserve">Bài 12: Làm chuồn chuồn thăng bằng (tiết 1)</w:t>
+              <w:t xml:space="preserve">Ôn tập học kỳ i</w:t>
             </w:r>
           </w:p>
         </w:tc>
@@ -2076,6 +2634,789 @@
                 <w:sz w:val="18"/>
                 <w:szCs w:val="18"/>
               </w:rPr>
+              <w:t xml:space="preserve">1 tiết</w:t>
+            </w:r>
+          </w:p>
+        </w:tc>
+        <w:tc>
+          <w:tcPr>
+            <w:tcW w:w="1100" w:type="dxa"/>
+            <w:tcBorders>
+              <w:bottom w:val="single" w:sz="8" w:space="0" w:color="000000"/>
+            </w:tcBorders>
+            <w:vAlign w:val="center"/>
+          </w:tcPr>
+          <w:p>
+            <w:pPr>
+              <w:jc w:val="center"/>
+              <w:spacing w:before="0" w:after="0" w:line="240" w:lineRule="auto"/>
+            </w:pPr>
+            <w:r>
+              <w:rPr>
+                <w:rFonts w:ascii="Times New Roman" w:hAnsi="Times New Roman" w:eastAsia="Times New Roman"/>
+                <w:sz w:val="18"/>
+                <w:szCs w:val="18"/>
+              </w:rPr>
+              <w:t xml:space="preserve">17</w:t>
+            </w:r>
+          </w:p>
+        </w:tc>
+        <w:tc>
+          <w:tcPr>
+            <w:tcW w:w="3100" w:type="dxa"/>
+            <w:tcBorders>
+              <w:bottom w:val="single" w:sz="8" w:space="0" w:color="000000"/>
+            </w:tcBorders>
+            <w:vAlign w:val="center"/>
+          </w:tcPr>
+          <w:p>
+            <w:pPr>
+              <w:jc w:val="left"/>
+              <w:spacing w:before="0" w:after="0" w:line="240" w:lineRule="auto"/>
+            </w:pPr>
+            <w:r>
+              <w:rPr>
+                <w:rFonts w:ascii="Times New Roman" w:hAnsi="Times New Roman" w:eastAsia="Times New Roman"/>
+                <w:sz w:val="17"/>
+                <w:szCs w:val="17"/>
+              </w:rPr>
+              <w:t xml:space="preserve"/>
+            </w:r>
+          </w:p>
+        </w:tc>
+      </w:tr>
+      <w:tr>
+        <w:tc>
+          <w:tcPr>
+            <w:tcW w:w="750" w:type="dxa"/>
+            <w:tcBorders>
+              <w:bottom w:val="single" w:sz="8" w:space="0" w:color="000000"/>
+            </w:tcBorders>
+            <w:vAlign w:val="center"/>
+          </w:tcPr>
+          <w:p>
+            <w:pPr>
+              <w:jc w:val="center"/>
+              <w:spacing w:before="0" w:after="0" w:line="240" w:lineRule="auto"/>
+            </w:pPr>
+            <w:r>
+              <w:rPr>
+                <w:rFonts w:ascii="Times New Roman" w:hAnsi="Times New Roman" w:eastAsia="Times New Roman"/>
+                <w:sz w:val="18"/>
+                <w:szCs w:val="18"/>
+              </w:rPr>
+              <w:t xml:space="preserve">18</w:t>
+            </w:r>
+          </w:p>
+        </w:tc>
+        <w:tc>
+          <w:tcPr>
+            <w:tcW w:w="2750" w:type="dxa"/>
+            <w:tcBorders>
+              <w:bottom w:val="single" w:sz="8" w:space="0" w:color="000000"/>
+            </w:tcBorders>
+            <w:vAlign w:val="center"/>
+          </w:tcPr>
+          <w:p>
+            <w:pPr>
+              <w:jc w:val="left"/>
+              <w:spacing w:before="0" w:after="0" w:line="240" w:lineRule="auto"/>
+            </w:pPr>
+            <w:r>
+              <w:rPr>
+                <w:rFonts w:ascii="Times New Roman" w:hAnsi="Times New Roman" w:eastAsia="Times New Roman"/>
+                <w:sz w:val="18"/>
+                <w:szCs w:val="18"/>
+              </w:rPr>
+              <w:t xml:space="preserve"/>
+            </w:r>
+          </w:p>
+        </w:tc>
+        <w:tc>
+          <w:tcPr>
+            <w:tcW w:w="5550" w:type="dxa"/>
+            <w:tcBorders>
+              <w:bottom w:val="single" w:sz="8" w:space="0" w:color="000000"/>
+            </w:tcBorders>
+            <w:vAlign w:val="center"/>
+          </w:tcPr>
+          <w:p>
+            <w:pPr>
+              <w:jc w:val="left"/>
+              <w:spacing w:before="0" w:after="0" w:line="240" w:lineRule="auto"/>
+            </w:pPr>
+            <w:r>
+              <w:rPr>
+                <w:rFonts w:ascii="Times New Roman" w:hAnsi="Times New Roman" w:eastAsia="Times New Roman"/>
+                <w:sz w:val="18"/>
+                <w:szCs w:val="18"/>
+              </w:rPr>
+              <w:t xml:space="preserve">Kiểm tra cuối học kì I</w:t>
+            </w:r>
+          </w:p>
+        </w:tc>
+        <w:tc>
+          <w:tcPr>
+            <w:tcW w:w="1150" w:type="dxa"/>
+            <w:tcBorders>
+              <w:bottom w:val="single" w:sz="8" w:space="0" w:color="000000"/>
+            </w:tcBorders>
+            <w:vAlign w:val="center"/>
+          </w:tcPr>
+          <w:p>
+            <w:pPr>
+              <w:jc w:val="center"/>
+              <w:spacing w:before="0" w:after="0" w:line="240" w:lineRule="auto"/>
+            </w:pPr>
+            <w:r>
+              <w:rPr>
+                <w:rFonts w:ascii="Times New Roman" w:hAnsi="Times New Roman" w:eastAsia="Times New Roman"/>
+                <w:sz w:val="18"/>
+                <w:szCs w:val="18"/>
+              </w:rPr>
+              <w:t xml:space="preserve">1 tiết</w:t>
+            </w:r>
+          </w:p>
+        </w:tc>
+        <w:tc>
+          <w:tcPr>
+            <w:tcW w:w="1100" w:type="dxa"/>
+            <w:tcBorders>
+              <w:bottom w:val="single" w:sz="8" w:space="0" w:color="000000"/>
+            </w:tcBorders>
+            <w:vAlign w:val="center"/>
+          </w:tcPr>
+          <w:p>
+            <w:pPr>
+              <w:jc w:val="center"/>
+              <w:spacing w:before="0" w:after="0" w:line="240" w:lineRule="auto"/>
+            </w:pPr>
+            <w:r>
+              <w:rPr>
+                <w:rFonts w:ascii="Times New Roman" w:hAnsi="Times New Roman" w:eastAsia="Times New Roman"/>
+                <w:sz w:val="18"/>
+                <w:szCs w:val="18"/>
+              </w:rPr>
+              <w:t xml:space="preserve">18</w:t>
+            </w:r>
+          </w:p>
+        </w:tc>
+        <w:tc>
+          <w:tcPr>
+            <w:tcW w:w="3100" w:type="dxa"/>
+            <w:tcBorders>
+              <w:bottom w:val="single" w:sz="8" w:space="0" w:color="000000"/>
+            </w:tcBorders>
+            <w:vAlign w:val="center"/>
+          </w:tcPr>
+          <w:p>
+            <w:pPr>
+              <w:jc w:val="left"/>
+              <w:spacing w:before="0" w:after="0" w:line="240" w:lineRule="auto"/>
+            </w:pPr>
+            <w:r>
+              <w:rPr>
+                <w:rFonts w:ascii="Times New Roman" w:hAnsi="Times New Roman" w:eastAsia="Times New Roman"/>
+                <w:sz w:val="17"/>
+                <w:szCs w:val="17"/>
+              </w:rPr>
+              <w:t xml:space="preserve"/>
+            </w:r>
+          </w:p>
+        </w:tc>
+      </w:tr>
+    </w:tbl>
+    <w:p>
+      <w:pPr>
+        <w:spacing w:before="0" w:after="80" w:line="276" w:lineRule="auto"/>
+      </w:pPr>
+      <w:r>
+        <w:rPr>
+          <w:rFonts w:ascii="Times New Roman" w:hAnsi="Times New Roman" w:eastAsia="Times New Roman"/>
+          <w:sz w:val="24"/>
+          <w:szCs w:val="24"/>
+        </w:rPr>
+        <w:t xml:space="preserve"/>
+      </w:r>
+    </w:p>
+    <w:tbl>
+      <w:tblPr>
+        <w:tblW w:w="14400" w:type="dxa"/>
+        <w:jc w:val="center"/>
+        <w:tblBorders>
+          <w:top w:val="single" w:sz="4" w:color="000000"/>
+          <w:left w:val="single" w:sz="4" w:color="000000"/>
+          <w:bottom w:val="single" w:sz="4" w:color="000000"/>
+          <w:right w:val="single" w:sz="4" w:color="000000"/>
+          <w:insideH w:val="dashed" w:sz="4" w:color="A6A6A6"/>
+          <w:insideV w:val="single" w:sz="4" w:color="000000"/>
+        </w:tblBorders>
+        <w:tblLayout w:type="fixed"/>
+      </w:tblPr>
+      <w:tblGrid>
+        <w:gridCol w:w="750"/>
+        <w:gridCol w:w="2750"/>
+        <w:gridCol w:w="5550"/>
+        <w:gridCol w:w="1150"/>
+        <w:gridCol w:w="1100"/>
+        <w:gridCol w:w="3100"/>
+      </w:tblGrid>
+      <w:tr>
+        <w:tc>
+          <w:tcPr>
+            <w:tcW w:w="14400" w:type="dxa"/>
+            <w:gridSpan w:val="6"/>
+            <w:tcBorders>
+              <w:bottom w:val="single" w:sz="8" w:space="0" w:color="000000"/>
+            </w:tcBorders>
+            <w:vAlign w:val="center"/>
+          </w:tcPr>
+          <w:p>
+            <w:pPr>
+              <w:jc w:val="center"/>
+              <w:spacing w:before="0" w:after="0" w:line="240" w:lineRule="auto"/>
+            </w:pPr>
+            <w:r>
+              <w:rPr>
+                <w:rFonts w:ascii="Times New Roman" w:hAnsi="Times New Roman" w:eastAsia="Times New Roman"/>
+                <w:b/>
+                <w:color w:val="002060"/>
+                <w:sz w:val="20"/>
+                <w:szCs w:val="20"/>
+              </w:rPr>
+              <w:t xml:space="preserve">HỌC KÌ II</w:t>
+            </w:r>
+          </w:p>
+        </w:tc>
+      </w:tr>
+      <w:tr>
+        <w:trPr>
+          <w:tblHeader/>
+        </w:trPr>
+        <w:tc>
+          <w:tcPr>
+            <w:tcW w:w="750" w:type="dxa"/>
+            <w:tcBorders>
+              <w:bottom w:val="single" w:sz="8" w:space="0" w:color="000000"/>
+            </w:tcBorders>
+            <w:vAlign w:val="center"/>
+          </w:tcPr>
+          <w:p>
+            <w:pPr>
+              <w:jc w:val="center"/>
+              <w:spacing w:before="0" w:after="0" w:line="240" w:lineRule="auto"/>
+            </w:pPr>
+            <w:r>
+              <w:rPr>
+                <w:rFonts w:ascii="Times New Roman" w:hAnsi="Times New Roman" w:eastAsia="Times New Roman"/>
+                <w:b/>
+                <w:color w:val="002060"/>
+                <w:sz w:val="18"/>
+                <w:szCs w:val="18"/>
+              </w:rPr>
+              <w:t xml:space="preserve">Tuần</w:t>
+            </w:r>
+          </w:p>
+        </w:tc>
+        <w:tc>
+          <w:tcPr>
+            <w:tcW w:w="2750" w:type="dxa"/>
+            <w:tcBorders>
+              <w:bottom w:val="single" w:sz="8" w:space="0" w:color="000000"/>
+            </w:tcBorders>
+            <w:vAlign w:val="center"/>
+          </w:tcPr>
+          <w:p>
+            <w:pPr>
+              <w:jc w:val="center"/>
+              <w:spacing w:before="0" w:after="0" w:line="240" w:lineRule="auto"/>
+            </w:pPr>
+            <w:r>
+              <w:rPr>
+                <w:rFonts w:ascii="Times New Roman" w:hAnsi="Times New Roman" w:eastAsia="Times New Roman"/>
+                <w:b/>
+                <w:color w:val="002060"/>
+                <w:sz w:val="18"/>
+                <w:szCs w:val="18"/>
+              </w:rPr>
+              <w:t xml:space="preserve">Chủ đề/ Mạch nội dung</w:t>
+            </w:r>
+          </w:p>
+        </w:tc>
+        <w:tc>
+          <w:tcPr>
+            <w:tcW w:w="5550" w:type="dxa"/>
+            <w:tcBorders>
+              <w:bottom w:val="single" w:sz="8" w:space="0" w:color="000000"/>
+            </w:tcBorders>
+            <w:vAlign w:val="center"/>
+          </w:tcPr>
+          <w:p>
+            <w:pPr>
+              <w:jc w:val="center"/>
+              <w:spacing w:before="0" w:after="0" w:line="240" w:lineRule="auto"/>
+            </w:pPr>
+            <w:r>
+              <w:rPr>
+                <w:rFonts w:ascii="Times New Roman" w:hAnsi="Times New Roman" w:eastAsia="Times New Roman"/>
+                <w:b/>
+                <w:color w:val="002060"/>
+                <w:sz w:val="18"/>
+                <w:szCs w:val="18"/>
+              </w:rPr>
+              <w:t xml:space="preserve">Nội dung hoạt động</w:t>
+            </w:r>
+          </w:p>
+        </w:tc>
+        <w:tc>
+          <w:tcPr>
+            <w:tcW w:w="1150" w:type="dxa"/>
+            <w:tcBorders>
+              <w:bottom w:val="single" w:sz="8" w:space="0" w:color="000000"/>
+            </w:tcBorders>
+            <w:vAlign w:val="center"/>
+          </w:tcPr>
+          <w:p>
+            <w:pPr>
+              <w:jc w:val="center"/>
+              <w:spacing w:before="0" w:after="0" w:line="240" w:lineRule="auto"/>
+            </w:pPr>
+            <w:r>
+              <w:rPr>
+                <w:rFonts w:ascii="Times New Roman" w:hAnsi="Times New Roman" w:eastAsia="Times New Roman"/>
+                <w:b/>
+                <w:color w:val="002060"/>
+                <w:sz w:val="18"/>
+                <w:szCs w:val="18"/>
+              </w:rPr>
+              <w:t xml:space="preserve">Thời lượng (tiết)</w:t>
+            </w:r>
+          </w:p>
+        </w:tc>
+        <w:tc>
+          <w:tcPr>
+            <w:tcW w:w="1100" w:type="dxa"/>
+            <w:tcBorders>
+              <w:bottom w:val="single" w:sz="8" w:space="0" w:color="000000"/>
+            </w:tcBorders>
+            <w:vAlign w:val="center"/>
+          </w:tcPr>
+          <w:p>
+            <w:pPr>
+              <w:jc w:val="center"/>
+              <w:spacing w:before="0" w:after="0" w:line="240" w:lineRule="auto"/>
+            </w:pPr>
+            <w:r>
+              <w:rPr>
+                <w:rFonts w:ascii="Times New Roman" w:hAnsi="Times New Roman" w:eastAsia="Times New Roman"/>
+                <w:b/>
+                <w:color w:val="002060"/>
+                <w:sz w:val="18"/>
+                <w:szCs w:val="18"/>
+              </w:rPr>
+              <w:t xml:space="preserve">Tiết theo KH môn học</w:t>
+            </w:r>
+          </w:p>
+        </w:tc>
+        <w:tc>
+          <w:tcPr>
+            <w:tcW w:w="3100" w:type="dxa"/>
+            <w:tcBorders>
+              <w:bottom w:val="single" w:sz="8" w:space="0" w:color="000000"/>
+            </w:tcBorders>
+            <w:vAlign w:val="center"/>
+          </w:tcPr>
+          <w:p>
+            <w:pPr>
+              <w:jc w:val="center"/>
+              <w:spacing w:before="0" w:after="0" w:line="240" w:lineRule="auto"/>
+            </w:pPr>
+            <w:r>
+              <w:rPr>
+                <w:rFonts w:ascii="Times New Roman" w:hAnsi="Times New Roman" w:eastAsia="Times New Roman"/>
+                <w:b/>
+                <w:color w:val="002060"/>
+                <w:sz w:val="18"/>
+                <w:szCs w:val="18"/>
+              </w:rPr>
+              <w:t xml:space="preserve">Nội dung điều chỉnh, bổ sung / tích hợp dự kiến</w:t>
+            </w:r>
+          </w:p>
+        </w:tc>
+      </w:tr>
+      <w:tr>
+        <w:tc>
+          <w:tcPr>
+            <w:tcW w:w="750" w:type="dxa"/>
+            <w:tcBorders>
+              <w:bottom w:val="single" w:sz="8" w:space="0" w:color="000000"/>
+            </w:tcBorders>
+            <w:vAlign w:val="center"/>
+          </w:tcPr>
+          <w:p>
+            <w:pPr>
+              <w:jc w:val="center"/>
+              <w:spacing w:before="0" w:after="0" w:line="240" w:lineRule="auto"/>
+            </w:pPr>
+            <w:r>
+              <w:rPr>
+                <w:rFonts w:ascii="Times New Roman" w:hAnsi="Times New Roman" w:eastAsia="Times New Roman"/>
+                <w:sz w:val="18"/>
+                <w:szCs w:val="18"/>
+              </w:rPr>
+              <w:t xml:space="preserve">19</w:t>
+            </w:r>
+          </w:p>
+        </w:tc>
+        <w:tc>
+          <w:tcPr>
+            <w:tcW w:w="2750" w:type="dxa"/>
+            <w:tcBorders>
+              <w:bottom w:val="single" w:sz="8" w:space="0" w:color="000000"/>
+            </w:tcBorders>
+            <w:vAlign w:val="center"/>
+          </w:tcPr>
+          <w:p>
+            <w:pPr>
+              <w:jc w:val="left"/>
+              <w:spacing w:before="0" w:after="0" w:line="240" w:lineRule="auto"/>
+            </w:pPr>
+            <w:r>
+              <w:rPr>
+                <w:rFonts w:ascii="Times New Roman" w:hAnsi="Times New Roman" w:eastAsia="Times New Roman"/>
+                <w:b/>
+                <w:color w:val="002060"/>
+                <w:sz w:val="18"/>
+                <w:szCs w:val="18"/>
+              </w:rPr>
+              <w:t xml:space="preserve">Chủ đề 1: CÔNG NGHỆ VÀ ĐỜI SỐNG</w:t>
+            </w:r>
+          </w:p>
+        </w:tc>
+        <w:tc>
+          <w:tcPr>
+            <w:tcW w:w="5550" w:type="dxa"/>
+            <w:tcBorders>
+              <w:bottom w:val="single" w:sz="8" w:space="0" w:color="000000"/>
+            </w:tcBorders>
+            <w:vAlign w:val="center"/>
+          </w:tcPr>
+          <w:p>
+            <w:pPr>
+              <w:jc w:val="left"/>
+              <w:spacing w:before="0" w:after="0" w:line="240" w:lineRule="auto"/>
+            </w:pPr>
+            <w:r>
+              <w:rPr>
+                <w:rFonts w:ascii="Times New Roman" w:hAnsi="Times New Roman" w:eastAsia="Times New Roman"/>
+                <w:sz w:val="18"/>
+                <w:szCs w:val="18"/>
+              </w:rPr>
+              <w:t xml:space="preserve">Bài 6: Chăm sóc hoa, cây cảnh trong chậu (tiết 2)</w:t>
+            </w:r>
+          </w:p>
+        </w:tc>
+        <w:tc>
+          <w:tcPr>
+            <w:tcW w:w="1150" w:type="dxa"/>
+            <w:tcBorders>
+              <w:bottom w:val="single" w:sz="8" w:space="0" w:color="000000"/>
+            </w:tcBorders>
+            <w:vAlign w:val="center"/>
+          </w:tcPr>
+          <w:p>
+            <w:pPr>
+              <w:jc w:val="center"/>
+              <w:spacing w:before="0" w:after="0" w:line="240" w:lineRule="auto"/>
+            </w:pPr>
+            <w:r>
+              <w:rPr>
+                <w:rFonts w:ascii="Times New Roman" w:hAnsi="Times New Roman" w:eastAsia="Times New Roman"/>
+                <w:sz w:val="18"/>
+                <w:szCs w:val="18"/>
+              </w:rPr>
+              <w:t xml:space="preserve"/>
+            </w:r>
+          </w:p>
+        </w:tc>
+        <w:tc>
+          <w:tcPr>
+            <w:tcW w:w="1100" w:type="dxa"/>
+            <w:tcBorders>
+              <w:bottom w:val="single" w:sz="8" w:space="0" w:color="000000"/>
+            </w:tcBorders>
+            <w:vAlign w:val="center"/>
+          </w:tcPr>
+          <w:p>
+            <w:pPr>
+              <w:jc w:val="center"/>
+              <w:spacing w:before="0" w:after="0" w:line="240" w:lineRule="auto"/>
+            </w:pPr>
+            <w:r>
+              <w:rPr>
+                <w:rFonts w:ascii="Times New Roman" w:hAnsi="Times New Roman" w:eastAsia="Times New Roman"/>
+                <w:sz w:val="18"/>
+                <w:szCs w:val="18"/>
+              </w:rPr>
+              <w:t xml:space="preserve">19</w:t>
+            </w:r>
+          </w:p>
+        </w:tc>
+        <w:tc>
+          <w:tcPr>
+            <w:tcW w:w="3100" w:type="dxa"/>
+            <w:tcBorders>
+              <w:bottom w:val="single" w:sz="8" w:space="0" w:color="000000"/>
+            </w:tcBorders>
+            <w:vAlign w:val="center"/>
+          </w:tcPr>
+          <w:p>
+            <w:pPr>
+              <w:jc w:val="left"/>
+              <w:spacing w:before="0" w:after="0" w:line="240" w:lineRule="auto"/>
+            </w:pPr>
+            <w:r>
+              <w:rPr>
+                <w:rFonts w:ascii="Times New Roman" w:hAnsi="Times New Roman" w:eastAsia="Times New Roman"/>
+                <w:sz w:val="17"/>
+                <w:szCs w:val="17"/>
+              </w:rPr>
+              <w:t xml:space="preserve"/>
+            </w:r>
+          </w:p>
+        </w:tc>
+      </w:tr>
+      <w:tr>
+        <w:tc>
+          <w:tcPr>
+            <w:tcW w:w="750" w:type="dxa"/>
+            <w:tcBorders>
+              <w:bottom w:val="single" w:sz="8" w:space="0" w:color="000000"/>
+            </w:tcBorders>
+            <w:vAlign w:val="center"/>
+          </w:tcPr>
+          <w:p>
+            <w:pPr>
+              <w:jc w:val="center"/>
+              <w:spacing w:before="0" w:after="0" w:line="240" w:lineRule="auto"/>
+            </w:pPr>
+            <w:r>
+              <w:rPr>
+                <w:rFonts w:ascii="Times New Roman" w:hAnsi="Times New Roman" w:eastAsia="Times New Roman"/>
+                <w:sz w:val="18"/>
+                <w:szCs w:val="18"/>
+              </w:rPr>
+              <w:t xml:space="preserve">20</w:t>
+            </w:r>
+          </w:p>
+        </w:tc>
+        <w:tc>
+          <w:tcPr>
+            <w:tcW w:w="2750" w:type="dxa"/>
+            <w:tcBorders>
+              <w:bottom w:val="single" w:sz="8" w:space="0" w:color="000000"/>
+            </w:tcBorders>
+            <w:vAlign w:val="center"/>
+          </w:tcPr>
+          <w:p>
+            <w:pPr>
+              <w:jc w:val="left"/>
+              <w:spacing w:before="0" w:after="0" w:line="240" w:lineRule="auto"/>
+            </w:pPr>
+            <w:r>
+              <w:rPr>
+                <w:rFonts w:ascii="Times New Roman" w:hAnsi="Times New Roman" w:eastAsia="Times New Roman"/>
+                <w:sz w:val="18"/>
+                <w:szCs w:val="18"/>
+              </w:rPr>
+              <w:t xml:space="preserve"/>
+            </w:r>
+          </w:p>
+        </w:tc>
+        <w:tc>
+          <w:tcPr>
+            <w:tcW w:w="5550" w:type="dxa"/>
+            <w:tcBorders>
+              <w:bottom w:val="single" w:sz="8" w:space="0" w:color="000000"/>
+            </w:tcBorders>
+            <w:vAlign w:val="center"/>
+          </w:tcPr>
+          <w:p>
+            <w:pPr>
+              <w:jc w:val="left"/>
+              <w:spacing w:before="0" w:after="0" w:line="240" w:lineRule="auto"/>
+            </w:pPr>
+            <w:r>
+              <w:rPr>
+                <w:rFonts w:ascii="Times New Roman" w:hAnsi="Times New Roman" w:eastAsia="Times New Roman"/>
+                <w:sz w:val="18"/>
+                <w:szCs w:val="18"/>
+              </w:rPr>
+              <w:t xml:space="preserve">Bài 6: Chăm sóc hoa, cây cảnh trong chậu</w:t>
+            </w:r>
+          </w:p>
+        </w:tc>
+        <w:tc>
+          <w:tcPr>
+            <w:tcW w:w="1150" w:type="dxa"/>
+            <w:tcBorders>
+              <w:bottom w:val="single" w:sz="8" w:space="0" w:color="000000"/>
+            </w:tcBorders>
+            <w:vAlign w:val="center"/>
+          </w:tcPr>
+          <w:p>
+            <w:pPr>
+              <w:jc w:val="center"/>
+              <w:spacing w:before="0" w:after="0" w:line="240" w:lineRule="auto"/>
+            </w:pPr>
+            <w:r>
+              <w:rPr>
+                <w:rFonts w:ascii="Times New Roman" w:hAnsi="Times New Roman" w:eastAsia="Times New Roman"/>
+                <w:sz w:val="18"/>
+                <w:szCs w:val="18"/>
+              </w:rPr>
+              <w:t xml:space="preserve"/>
+            </w:r>
+          </w:p>
+        </w:tc>
+        <w:tc>
+          <w:tcPr>
+            <w:tcW w:w="1100" w:type="dxa"/>
+            <w:tcBorders>
+              <w:bottom w:val="single" w:sz="8" w:space="0" w:color="000000"/>
+            </w:tcBorders>
+            <w:vAlign w:val="center"/>
+          </w:tcPr>
+          <w:p>
+            <w:pPr>
+              <w:jc w:val="center"/>
+              <w:spacing w:before="0" w:after="0" w:line="240" w:lineRule="auto"/>
+            </w:pPr>
+            <w:r>
+              <w:rPr>
+                <w:rFonts w:ascii="Times New Roman" w:hAnsi="Times New Roman" w:eastAsia="Times New Roman"/>
+                <w:sz w:val="18"/>
+                <w:szCs w:val="18"/>
+              </w:rPr>
+              <w:t xml:space="preserve">20</w:t>
+            </w:r>
+          </w:p>
+        </w:tc>
+        <w:tc>
+          <w:tcPr>
+            <w:tcW w:w="3100" w:type="dxa"/>
+            <w:tcBorders>
+              <w:bottom w:val="single" w:sz="8" w:space="0" w:color="000000"/>
+            </w:tcBorders>
+            <w:vAlign w:val="center"/>
+          </w:tcPr>
+          <w:p>
+            <w:pPr>
+              <w:jc w:val="left"/>
+              <w:spacing w:before="0" w:after="0" w:line="240" w:lineRule="auto"/>
+            </w:pPr>
+            <w:r>
+              <w:rPr>
+                <w:rFonts w:ascii="Times New Roman" w:hAnsi="Times New Roman" w:eastAsia="Times New Roman"/>
+                <w:sz w:val="17"/>
+                <w:szCs w:val="17"/>
+              </w:rPr>
+              <w:t xml:space="preserve"/>
+            </w:r>
+          </w:p>
+        </w:tc>
+      </w:tr>
+      <w:tr>
+        <w:tc>
+          <w:tcPr>
+            <w:tcW w:w="750" w:type="dxa"/>
+            <w:tcBorders>
+              <w:bottom w:val="single" w:sz="8" w:space="0" w:color="000000"/>
+            </w:tcBorders>
+            <w:vAlign w:val="center"/>
+          </w:tcPr>
+          <w:p>
+            <w:pPr>
+              <w:jc w:val="center"/>
+              <w:spacing w:before="0" w:after="0" w:line="240" w:lineRule="auto"/>
+            </w:pPr>
+            <w:r>
+              <w:rPr>
+                <w:rFonts w:ascii="Times New Roman" w:hAnsi="Times New Roman" w:eastAsia="Times New Roman"/>
+                <w:sz w:val="18"/>
+                <w:szCs w:val="18"/>
+              </w:rPr>
+              <w:t xml:space="preserve">21</w:t>
+            </w:r>
+          </w:p>
+        </w:tc>
+        <w:tc>
+          <w:tcPr>
+            <w:tcW w:w="2750" w:type="dxa"/>
+            <w:tcBorders>
+              <w:bottom w:val="single" w:sz="8" w:space="0" w:color="000000"/>
+            </w:tcBorders>
+            <w:vAlign w:val="center"/>
+          </w:tcPr>
+          <w:p>
+            <w:pPr>
+              <w:jc w:val="left"/>
+              <w:spacing w:before="0" w:after="0" w:line="240" w:lineRule="auto"/>
+            </w:pPr>
+            <w:r>
+              <w:rPr>
+                <w:rFonts w:ascii="Times New Roman" w:hAnsi="Times New Roman" w:eastAsia="Times New Roman"/>
+                <w:b/>
+                <w:color w:val="002060"/>
+                <w:sz w:val="18"/>
+                <w:szCs w:val="18"/>
+              </w:rPr>
+              <w:t xml:space="preserve">Chủ đề 2: THỦ CÔNG KĨ THUẬT</w:t>
+            </w:r>
+          </w:p>
+        </w:tc>
+        <w:tc>
+          <w:tcPr>
+            <w:tcW w:w="5550" w:type="dxa"/>
+            <w:tcBorders>
+              <w:bottom w:val="single" w:sz="8" w:space="0" w:color="000000"/>
+            </w:tcBorders>
+            <w:vAlign w:val="center"/>
+          </w:tcPr>
+          <w:p>
+            <w:pPr>
+              <w:jc w:val="left"/>
+              <w:spacing w:before="0" w:after="0" w:line="240" w:lineRule="auto"/>
+            </w:pPr>
+            <w:r>
+              <w:rPr>
+                <w:rFonts w:ascii="Times New Roman" w:hAnsi="Times New Roman" w:eastAsia="Times New Roman"/>
+                <w:sz w:val="18"/>
+                <w:szCs w:val="18"/>
+              </w:rPr>
+              <w:t xml:space="preserve">Bài 7: Giới thiệu bộ lắp ghép mô hình kĩ thuật (tiết 1)</w:t>
+            </w:r>
+          </w:p>
+        </w:tc>
+        <w:tc>
+          <w:tcPr>
+            <w:tcW w:w="1150" w:type="dxa"/>
+            <w:tcBorders>
+              <w:bottom w:val="single" w:sz="8" w:space="0" w:color="000000"/>
+            </w:tcBorders>
+            <w:vAlign w:val="center"/>
+          </w:tcPr>
+          <w:p>
+            <w:pPr>
+              <w:jc w:val="center"/>
+              <w:spacing w:before="0" w:after="0" w:line="240" w:lineRule="auto"/>
+            </w:pPr>
+            <w:r>
+              <w:rPr>
+                <w:rFonts w:ascii="Times New Roman" w:hAnsi="Times New Roman" w:eastAsia="Times New Roman"/>
+                <w:sz w:val="18"/>
+                <w:szCs w:val="18"/>
+              </w:rPr>
               <w:t xml:space="preserve">2 tiết</w:t>
             </w:r>
           </w:p>
@@ -2099,7 +3440,7 @@
                 <w:sz w:val="18"/>
                 <w:szCs w:val="18"/>
               </w:rPr>
-              <w:t xml:space="preserve">13</w:t>
+              <w:t xml:space="preserve">21</w:t>
             </w:r>
           </w:p>
         </w:tc>
@@ -2148,7 +3489,7 @@
                 <w:sz w:val="18"/>
                 <w:szCs w:val="18"/>
               </w:rPr>
-              <w:t xml:space="preserve">33</w:t>
+              <w:t xml:space="preserve">22</w:t>
             </w:r>
           </w:p>
         </w:tc>
@@ -2194,7 +3535,7 @@
                 <w:sz w:val="18"/>
                 <w:szCs w:val="18"/>
               </w:rPr>
-              <w:t xml:space="preserve">Bài 12: Làm chuồn chuồn thăng bằng (tiết 2)</w:t>
+              <w:t xml:space="preserve">Bài 7: Giới thiệu bộ lắp ghép mô hình kĩ thuật (tiết 2)</w:t>
             </w:r>
           </w:p>
         </w:tc>
@@ -2240,7 +3581,7 @@
                 <w:sz w:val="18"/>
                 <w:szCs w:val="18"/>
               </w:rPr>
-              <w:t xml:space="preserve">14</w:t>
+              <w:t xml:space="preserve">22</w:t>
             </w:r>
           </w:p>
         </w:tc>
@@ -2288,7 +3629,7 @@
                 <w:sz w:val="18"/>
                 <w:szCs w:val="18"/>
               </w:rPr>
-              <w:t xml:space="preserve">34</w:t>
+              <w:t xml:space="preserve">23</w:t>
             </w:r>
           </w:p>
         </w:tc>
@@ -2334,7 +3675,7 @@
                 <w:sz w:val="18"/>
                 <w:szCs w:val="18"/>
               </w:rPr>
-              <w:t xml:space="preserve">Ôn tập cuối năm</w:t>
+              <w:t xml:space="preserve">Bài 8: Lắp ghép mô hình bập bênh (tiết 1)</w:t>
             </w:r>
           </w:p>
         </w:tc>
@@ -2357,7 +3698,7 @@
                 <w:sz w:val="18"/>
                 <w:szCs w:val="18"/>
               </w:rPr>
-              <w:t xml:space="preserve">1 tiết</w:t>
+              <w:t xml:space="preserve">2 tiết</w:t>
             </w:r>
           </w:p>
         </w:tc>
@@ -2380,7 +3721,7 @@
                 <w:sz w:val="18"/>
                 <w:szCs w:val="18"/>
               </w:rPr>
-              <w:t xml:space="preserve">15</w:t>
+              <w:t xml:space="preserve">23</w:t>
             </w:r>
           </w:p>
         </w:tc>
@@ -2400,10 +3741,11 @@
             <w:r>
               <w:rPr>
                 <w:rFonts w:ascii="Times New Roman" w:hAnsi="Times New Roman" w:eastAsia="Times New Roman"/>
+                <w:i/>
                 <w:sz w:val="17"/>
                 <w:szCs w:val="17"/>
               </w:rPr>
-              <w:t xml:space="preserve"/>
+              <w:t xml:space="preserve">GD STEM; NLS-ST: Tìm tư liệu, xem video hướng dẫn kĩ thuật; tạo sản phẩm và chụp/quay lại quá trình (có hướng dẫn).</w:t>
             </w:r>
           </w:p>
         </w:tc>
@@ -2428,6 +3770,1550 @@
                 <w:sz w:val="18"/>
                 <w:szCs w:val="18"/>
               </w:rPr>
+              <w:t xml:space="preserve">24</w:t>
+            </w:r>
+          </w:p>
+        </w:tc>
+        <w:tc>
+          <w:tcPr>
+            <w:tcW w:w="2750" w:type="dxa"/>
+            <w:tcBorders>
+              <w:bottom w:val="single" w:sz="8" w:space="0" w:color="000000"/>
+            </w:tcBorders>
+            <w:vAlign w:val="center"/>
+          </w:tcPr>
+          <w:p>
+            <w:pPr>
+              <w:jc w:val="left"/>
+              <w:spacing w:before="0" w:after="0" w:line="240" w:lineRule="auto"/>
+            </w:pPr>
+            <w:r>
+              <w:rPr>
+                <w:rFonts w:ascii="Times New Roman" w:hAnsi="Times New Roman" w:eastAsia="Times New Roman"/>
+                <w:sz w:val="18"/>
+                <w:szCs w:val="18"/>
+              </w:rPr>
+              <w:t xml:space="preserve"/>
+            </w:r>
+          </w:p>
+        </w:tc>
+        <w:tc>
+          <w:tcPr>
+            <w:tcW w:w="5550" w:type="dxa"/>
+            <w:tcBorders>
+              <w:bottom w:val="single" w:sz="8" w:space="0" w:color="000000"/>
+            </w:tcBorders>
+            <w:vAlign w:val="center"/>
+          </w:tcPr>
+          <w:p>
+            <w:pPr>
+              <w:jc w:val="left"/>
+              <w:spacing w:before="0" w:after="0" w:line="240" w:lineRule="auto"/>
+            </w:pPr>
+            <w:r>
+              <w:rPr>
+                <w:rFonts w:ascii="Times New Roman" w:hAnsi="Times New Roman" w:eastAsia="Times New Roman"/>
+                <w:sz w:val="18"/>
+                <w:szCs w:val="18"/>
+              </w:rPr>
+              <w:t xml:space="preserve">Bài 8: Lắp ghép mô hình bập bênh (tiết 2)</w:t>
+            </w:r>
+          </w:p>
+        </w:tc>
+        <w:tc>
+          <w:tcPr>
+            <w:tcW w:w="1150" w:type="dxa"/>
+            <w:tcBorders>
+              <w:bottom w:val="single" w:sz="8" w:space="0" w:color="000000"/>
+            </w:tcBorders>
+            <w:vAlign w:val="center"/>
+          </w:tcPr>
+          <w:p>
+            <w:pPr>
+              <w:jc w:val="center"/>
+              <w:spacing w:before="0" w:after="0" w:line="240" w:lineRule="auto"/>
+            </w:pPr>
+            <w:r>
+              <w:rPr>
+                <w:rFonts w:ascii="Times New Roman" w:hAnsi="Times New Roman" w:eastAsia="Times New Roman"/>
+                <w:sz w:val="18"/>
+                <w:szCs w:val="18"/>
+              </w:rPr>
+              <w:t xml:space="preserve"/>
+            </w:r>
+          </w:p>
+        </w:tc>
+        <w:tc>
+          <w:tcPr>
+            <w:tcW w:w="1100" w:type="dxa"/>
+            <w:tcBorders>
+              <w:bottom w:val="single" w:sz="8" w:space="0" w:color="000000"/>
+            </w:tcBorders>
+            <w:vAlign w:val="center"/>
+          </w:tcPr>
+          <w:p>
+            <w:pPr>
+              <w:jc w:val="center"/>
+              <w:spacing w:before="0" w:after="0" w:line="240" w:lineRule="auto"/>
+            </w:pPr>
+            <w:r>
+              <w:rPr>
+                <w:rFonts w:ascii="Times New Roman" w:hAnsi="Times New Roman" w:eastAsia="Times New Roman"/>
+                <w:sz w:val="18"/>
+                <w:szCs w:val="18"/>
+              </w:rPr>
+              <w:t xml:space="preserve">24</w:t>
+            </w:r>
+          </w:p>
+        </w:tc>
+        <w:tc>
+          <w:tcPr>
+            <w:tcW w:w="3100" w:type="dxa"/>
+            <w:tcBorders>
+              <w:bottom w:val="single" w:sz="8" w:space="0" w:color="000000"/>
+            </w:tcBorders>
+            <w:vAlign w:val="center"/>
+          </w:tcPr>
+          <w:p>
+            <w:pPr>
+              <w:jc w:val="left"/>
+              <w:spacing w:before="0" w:after="0" w:line="240" w:lineRule="auto"/>
+            </w:pPr>
+            <w:r>
+              <w:rPr>
+                <w:rFonts w:ascii="Times New Roman" w:hAnsi="Times New Roman" w:eastAsia="Times New Roman"/>
+                <w:sz w:val="17"/>
+                <w:szCs w:val="17"/>
+              </w:rPr>
+              <w:t xml:space="preserve"/>
+            </w:r>
+          </w:p>
+        </w:tc>
+      </w:tr>
+      <w:tr>
+        <w:tc>
+          <w:tcPr>
+            <w:tcW w:w="750" w:type="dxa"/>
+            <w:tcBorders>
+              <w:bottom w:val="single" w:sz="8" w:space="0" w:color="000000"/>
+            </w:tcBorders>
+            <w:vAlign w:val="center"/>
+          </w:tcPr>
+          <w:p>
+            <w:pPr>
+              <w:jc w:val="center"/>
+              <w:spacing w:before="0" w:after="0" w:line="240" w:lineRule="auto"/>
+            </w:pPr>
+            <w:r>
+              <w:rPr>
+                <w:rFonts w:ascii="Times New Roman" w:hAnsi="Times New Roman" w:eastAsia="Times New Roman"/>
+                <w:sz w:val="18"/>
+                <w:szCs w:val="18"/>
+              </w:rPr>
+              <w:t xml:space="preserve">25</w:t>
+            </w:r>
+          </w:p>
+        </w:tc>
+        <w:tc>
+          <w:tcPr>
+            <w:tcW w:w="2750" w:type="dxa"/>
+            <w:tcBorders>
+              <w:bottom w:val="single" w:sz="8" w:space="0" w:color="000000"/>
+            </w:tcBorders>
+            <w:vAlign w:val="center"/>
+          </w:tcPr>
+          <w:p>
+            <w:pPr>
+              <w:jc w:val="left"/>
+              <w:spacing w:before="0" w:after="0" w:line="240" w:lineRule="auto"/>
+            </w:pPr>
+            <w:r>
+              <w:rPr>
+                <w:rFonts w:ascii="Times New Roman" w:hAnsi="Times New Roman" w:eastAsia="Times New Roman"/>
+                <w:sz w:val="18"/>
+                <w:szCs w:val="18"/>
+              </w:rPr>
+              <w:t xml:space="preserve"/>
+            </w:r>
+          </w:p>
+        </w:tc>
+        <w:tc>
+          <w:tcPr>
+            <w:tcW w:w="5550" w:type="dxa"/>
+            <w:tcBorders>
+              <w:bottom w:val="single" w:sz="8" w:space="0" w:color="000000"/>
+            </w:tcBorders>
+            <w:vAlign w:val="center"/>
+          </w:tcPr>
+          <w:p>
+            <w:pPr>
+              <w:jc w:val="left"/>
+              <w:spacing w:before="0" w:after="0" w:line="240" w:lineRule="auto"/>
+            </w:pPr>
+            <w:r>
+              <w:rPr>
+                <w:rFonts w:ascii="Times New Roman" w:hAnsi="Times New Roman" w:eastAsia="Times New Roman"/>
+                <w:sz w:val="18"/>
+                <w:szCs w:val="18"/>
+              </w:rPr>
+              <w:t xml:space="preserve">Bài 9: Lắp ghép mô hình rô-bốt (tiết 1)</w:t>
+            </w:r>
+          </w:p>
+        </w:tc>
+        <w:tc>
+          <w:tcPr>
+            <w:tcW w:w="1150" w:type="dxa"/>
+            <w:tcBorders>
+              <w:bottom w:val="single" w:sz="8" w:space="0" w:color="000000"/>
+            </w:tcBorders>
+            <w:vAlign w:val="center"/>
+          </w:tcPr>
+          <w:p>
+            <w:pPr>
+              <w:jc w:val="center"/>
+              <w:spacing w:before="0" w:after="0" w:line="240" w:lineRule="auto"/>
+            </w:pPr>
+            <w:r>
+              <w:rPr>
+                <w:rFonts w:ascii="Times New Roman" w:hAnsi="Times New Roman" w:eastAsia="Times New Roman"/>
+                <w:sz w:val="18"/>
+                <w:szCs w:val="18"/>
+              </w:rPr>
+              <w:t xml:space="preserve">3 tiết</w:t>
+            </w:r>
+          </w:p>
+        </w:tc>
+        <w:tc>
+          <w:tcPr>
+            <w:tcW w:w="1100" w:type="dxa"/>
+            <w:tcBorders>
+              <w:bottom w:val="single" w:sz="8" w:space="0" w:color="000000"/>
+            </w:tcBorders>
+            <w:vAlign w:val="center"/>
+          </w:tcPr>
+          <w:p>
+            <w:pPr>
+              <w:jc w:val="center"/>
+              <w:spacing w:before="0" w:after="0" w:line="240" w:lineRule="auto"/>
+            </w:pPr>
+            <w:r>
+              <w:rPr>
+                <w:rFonts w:ascii="Times New Roman" w:hAnsi="Times New Roman" w:eastAsia="Times New Roman"/>
+                <w:sz w:val="18"/>
+                <w:szCs w:val="18"/>
+              </w:rPr>
+              <w:t xml:space="preserve">25</w:t>
+            </w:r>
+          </w:p>
+        </w:tc>
+        <w:tc>
+          <w:tcPr>
+            <w:tcW w:w="3100" w:type="dxa"/>
+            <w:tcBorders>
+              <w:bottom w:val="single" w:sz="8" w:space="0" w:color="000000"/>
+            </w:tcBorders>
+            <w:vAlign w:val="center"/>
+          </w:tcPr>
+          <w:p>
+            <w:pPr>
+              <w:jc w:val="left"/>
+              <w:spacing w:before="0" w:after="0" w:line="240" w:lineRule="auto"/>
+            </w:pPr>
+            <w:r>
+              <w:rPr>
+                <w:rFonts w:ascii="Times New Roman" w:hAnsi="Times New Roman" w:eastAsia="Times New Roman"/>
+                <w:i/>
+                <w:sz w:val="17"/>
+                <w:szCs w:val="17"/>
+              </w:rPr>
+              <w:t xml:space="preserve">GD STEM; NLS-ST: Tìm tư liệu, xem video hướng dẫn kĩ thuật; tạo sản phẩm và chụp/quay lại quá trình (có hướng dẫn).</w:t>
+            </w:r>
+          </w:p>
+        </w:tc>
+      </w:tr>
+      <w:tr>
+        <w:tc>
+          <w:tcPr>
+            <w:tcW w:w="750" w:type="dxa"/>
+            <w:tcBorders>
+              <w:bottom w:val="single" w:sz="8" w:space="0" w:color="000000"/>
+            </w:tcBorders>
+            <w:vAlign w:val="center"/>
+          </w:tcPr>
+          <w:p>
+            <w:pPr>
+              <w:jc w:val="center"/>
+              <w:spacing w:before="0" w:after="0" w:line="240" w:lineRule="auto"/>
+            </w:pPr>
+            <w:r>
+              <w:rPr>
+                <w:rFonts w:ascii="Times New Roman" w:hAnsi="Times New Roman" w:eastAsia="Times New Roman"/>
+                <w:sz w:val="18"/>
+                <w:szCs w:val="18"/>
+              </w:rPr>
+              <w:t xml:space="preserve">26</w:t>
+            </w:r>
+          </w:p>
+        </w:tc>
+        <w:tc>
+          <w:tcPr>
+            <w:tcW w:w="2750" w:type="dxa"/>
+            <w:tcBorders>
+              <w:bottom w:val="single" w:sz="8" w:space="0" w:color="000000"/>
+            </w:tcBorders>
+            <w:vAlign w:val="center"/>
+          </w:tcPr>
+          <w:p>
+            <w:pPr>
+              <w:jc w:val="left"/>
+              <w:spacing w:before="0" w:after="0" w:line="240" w:lineRule="auto"/>
+            </w:pPr>
+            <w:r>
+              <w:rPr>
+                <w:rFonts w:ascii="Times New Roman" w:hAnsi="Times New Roman" w:eastAsia="Times New Roman"/>
+                <w:sz w:val="18"/>
+                <w:szCs w:val="18"/>
+              </w:rPr>
+              <w:t xml:space="preserve"/>
+            </w:r>
+          </w:p>
+        </w:tc>
+        <w:tc>
+          <w:tcPr>
+            <w:tcW w:w="5550" w:type="dxa"/>
+            <w:tcBorders>
+              <w:bottom w:val="single" w:sz="8" w:space="0" w:color="000000"/>
+            </w:tcBorders>
+            <w:vAlign w:val="center"/>
+          </w:tcPr>
+          <w:p>
+            <w:pPr>
+              <w:jc w:val="left"/>
+              <w:spacing w:before="0" w:after="0" w:line="240" w:lineRule="auto"/>
+            </w:pPr>
+            <w:r>
+              <w:rPr>
+                <w:rFonts w:ascii="Times New Roman" w:hAnsi="Times New Roman" w:eastAsia="Times New Roman"/>
+                <w:sz w:val="18"/>
+                <w:szCs w:val="18"/>
+              </w:rPr>
+              <w:t xml:space="preserve">Bài 9: Lắp ghép mô hình rô-bốt (tiết 2)</w:t>
+            </w:r>
+          </w:p>
+        </w:tc>
+        <w:tc>
+          <w:tcPr>
+            <w:tcW w:w="1150" w:type="dxa"/>
+            <w:tcBorders>
+              <w:bottom w:val="single" w:sz="8" w:space="0" w:color="000000"/>
+            </w:tcBorders>
+            <w:vAlign w:val="center"/>
+          </w:tcPr>
+          <w:p>
+            <w:pPr>
+              <w:jc w:val="center"/>
+              <w:spacing w:before="0" w:after="0" w:line="240" w:lineRule="auto"/>
+            </w:pPr>
+            <w:r>
+              <w:rPr>
+                <w:rFonts w:ascii="Times New Roman" w:hAnsi="Times New Roman" w:eastAsia="Times New Roman"/>
+                <w:sz w:val="18"/>
+                <w:szCs w:val="18"/>
+              </w:rPr>
+              <w:t xml:space="preserve"/>
+            </w:r>
+          </w:p>
+        </w:tc>
+        <w:tc>
+          <w:tcPr>
+            <w:tcW w:w="1100" w:type="dxa"/>
+            <w:tcBorders>
+              <w:bottom w:val="single" w:sz="8" w:space="0" w:color="000000"/>
+            </w:tcBorders>
+            <w:vAlign w:val="center"/>
+          </w:tcPr>
+          <w:p>
+            <w:pPr>
+              <w:jc w:val="center"/>
+              <w:spacing w:before="0" w:after="0" w:line="240" w:lineRule="auto"/>
+            </w:pPr>
+            <w:r>
+              <w:rPr>
+                <w:rFonts w:ascii="Times New Roman" w:hAnsi="Times New Roman" w:eastAsia="Times New Roman"/>
+                <w:sz w:val="18"/>
+                <w:szCs w:val="18"/>
+              </w:rPr>
+              <w:t xml:space="preserve">26</w:t>
+            </w:r>
+          </w:p>
+        </w:tc>
+        <w:tc>
+          <w:tcPr>
+            <w:tcW w:w="3100" w:type="dxa"/>
+            <w:tcBorders>
+              <w:bottom w:val="single" w:sz="8" w:space="0" w:color="000000"/>
+            </w:tcBorders>
+            <w:vAlign w:val="center"/>
+          </w:tcPr>
+          <w:p>
+            <w:pPr>
+              <w:jc w:val="left"/>
+              <w:spacing w:before="0" w:after="0" w:line="240" w:lineRule="auto"/>
+            </w:pPr>
+            <w:r>
+              <w:rPr>
+                <w:rFonts w:ascii="Times New Roman" w:hAnsi="Times New Roman" w:eastAsia="Times New Roman"/>
+                <w:sz w:val="17"/>
+                <w:szCs w:val="17"/>
+              </w:rPr>
+              <w:t xml:space="preserve"/>
+            </w:r>
+          </w:p>
+        </w:tc>
+      </w:tr>
+      <w:tr>
+        <w:tc>
+          <w:tcPr>
+            <w:tcW w:w="750" w:type="dxa"/>
+            <w:tcBorders>
+              <w:bottom w:val="single" w:sz="8" w:space="0" w:color="000000"/>
+            </w:tcBorders>
+            <w:vAlign w:val="center"/>
+          </w:tcPr>
+          <w:p>
+            <w:pPr>
+              <w:jc w:val="center"/>
+              <w:spacing w:before="0" w:after="0" w:line="240" w:lineRule="auto"/>
+            </w:pPr>
+            <w:r>
+              <w:rPr>
+                <w:rFonts w:ascii="Times New Roman" w:hAnsi="Times New Roman" w:eastAsia="Times New Roman"/>
+                <w:sz w:val="18"/>
+                <w:szCs w:val="18"/>
+              </w:rPr>
+              <w:t xml:space="preserve">27</w:t>
+            </w:r>
+          </w:p>
+        </w:tc>
+        <w:tc>
+          <w:tcPr>
+            <w:tcW w:w="2750" w:type="dxa"/>
+            <w:tcBorders>
+              <w:bottom w:val="single" w:sz="8" w:space="0" w:color="000000"/>
+            </w:tcBorders>
+            <w:vAlign w:val="center"/>
+          </w:tcPr>
+          <w:p>
+            <w:pPr>
+              <w:jc w:val="left"/>
+              <w:spacing w:before="0" w:after="0" w:line="240" w:lineRule="auto"/>
+            </w:pPr>
+            <w:r>
+              <w:rPr>
+                <w:rFonts w:ascii="Times New Roman" w:hAnsi="Times New Roman" w:eastAsia="Times New Roman"/>
+                <w:sz w:val="18"/>
+                <w:szCs w:val="18"/>
+              </w:rPr>
+              <w:t xml:space="preserve"/>
+            </w:r>
+          </w:p>
+        </w:tc>
+        <w:tc>
+          <w:tcPr>
+            <w:tcW w:w="5550" w:type="dxa"/>
+            <w:tcBorders>
+              <w:bottom w:val="single" w:sz="8" w:space="0" w:color="000000"/>
+            </w:tcBorders>
+            <w:vAlign w:val="center"/>
+          </w:tcPr>
+          <w:p>
+            <w:pPr>
+              <w:jc w:val="left"/>
+              <w:spacing w:before="0" w:after="0" w:line="240" w:lineRule="auto"/>
+            </w:pPr>
+            <w:r>
+              <w:rPr>
+                <w:rFonts w:ascii="Times New Roman" w:hAnsi="Times New Roman" w:eastAsia="Times New Roman"/>
+                <w:sz w:val="18"/>
+                <w:szCs w:val="18"/>
+              </w:rPr>
+              <w:t xml:space="preserve">Bài 9: Lắp ghép mô hình rô-bốt (tiết 3)</w:t>
+            </w:r>
+          </w:p>
+        </w:tc>
+        <w:tc>
+          <w:tcPr>
+            <w:tcW w:w="1150" w:type="dxa"/>
+            <w:tcBorders>
+              <w:bottom w:val="single" w:sz="8" w:space="0" w:color="000000"/>
+            </w:tcBorders>
+            <w:vAlign w:val="center"/>
+          </w:tcPr>
+          <w:p>
+            <w:pPr>
+              <w:jc w:val="center"/>
+              <w:spacing w:before="0" w:after="0" w:line="240" w:lineRule="auto"/>
+            </w:pPr>
+            <w:r>
+              <w:rPr>
+                <w:rFonts w:ascii="Times New Roman" w:hAnsi="Times New Roman" w:eastAsia="Times New Roman"/>
+                <w:sz w:val="18"/>
+                <w:szCs w:val="18"/>
+              </w:rPr>
+              <w:t xml:space="preserve"/>
+            </w:r>
+          </w:p>
+        </w:tc>
+        <w:tc>
+          <w:tcPr>
+            <w:tcW w:w="1100" w:type="dxa"/>
+            <w:tcBorders>
+              <w:bottom w:val="single" w:sz="8" w:space="0" w:color="000000"/>
+            </w:tcBorders>
+            <w:vAlign w:val="center"/>
+          </w:tcPr>
+          <w:p>
+            <w:pPr>
+              <w:jc w:val="center"/>
+              <w:spacing w:before="0" w:after="0" w:line="240" w:lineRule="auto"/>
+            </w:pPr>
+            <w:r>
+              <w:rPr>
+                <w:rFonts w:ascii="Times New Roman" w:hAnsi="Times New Roman" w:eastAsia="Times New Roman"/>
+                <w:sz w:val="18"/>
+                <w:szCs w:val="18"/>
+              </w:rPr>
+              <w:t xml:space="preserve">27</w:t>
+            </w:r>
+          </w:p>
+        </w:tc>
+        <w:tc>
+          <w:tcPr>
+            <w:tcW w:w="3100" w:type="dxa"/>
+            <w:tcBorders>
+              <w:bottom w:val="single" w:sz="8" w:space="0" w:color="000000"/>
+            </w:tcBorders>
+            <w:vAlign w:val="center"/>
+          </w:tcPr>
+          <w:p>
+            <w:pPr>
+              <w:jc w:val="left"/>
+              <w:spacing w:before="0" w:after="0" w:line="240" w:lineRule="auto"/>
+            </w:pPr>
+            <w:r>
+              <w:rPr>
+                <w:rFonts w:ascii="Times New Roman" w:hAnsi="Times New Roman" w:eastAsia="Times New Roman"/>
+                <w:sz w:val="17"/>
+                <w:szCs w:val="17"/>
+              </w:rPr>
+              <w:t xml:space="preserve"/>
+            </w:r>
+          </w:p>
+        </w:tc>
+      </w:tr>
+      <w:tr>
+        <w:tc>
+          <w:tcPr>
+            <w:tcW w:w="750" w:type="dxa"/>
+            <w:tcBorders>
+              <w:bottom w:val="single" w:sz="8" w:space="0" w:color="000000"/>
+            </w:tcBorders>
+            <w:vAlign w:val="center"/>
+          </w:tcPr>
+          <w:p>
+            <w:pPr>
+              <w:jc w:val="center"/>
+              <w:spacing w:before="0" w:after="0" w:line="240" w:lineRule="auto"/>
+            </w:pPr>
+            <w:r>
+              <w:rPr>
+                <w:rFonts w:ascii="Times New Roman" w:hAnsi="Times New Roman" w:eastAsia="Times New Roman"/>
+                <w:sz w:val="18"/>
+                <w:szCs w:val="18"/>
+              </w:rPr>
+              <w:t xml:space="preserve">28</w:t>
+            </w:r>
+          </w:p>
+        </w:tc>
+        <w:tc>
+          <w:tcPr>
+            <w:tcW w:w="2750" w:type="dxa"/>
+            <w:tcBorders>
+              <w:bottom w:val="single" w:sz="8" w:space="0" w:color="000000"/>
+            </w:tcBorders>
+            <w:vAlign w:val="center"/>
+          </w:tcPr>
+          <w:p>
+            <w:pPr>
+              <w:jc w:val="left"/>
+              <w:spacing w:before="0" w:after="0" w:line="240" w:lineRule="auto"/>
+            </w:pPr>
+            <w:r>
+              <w:rPr>
+                <w:rFonts w:ascii="Times New Roman" w:hAnsi="Times New Roman" w:eastAsia="Times New Roman"/>
+                <w:sz w:val="18"/>
+                <w:szCs w:val="18"/>
+              </w:rPr>
+              <w:t xml:space="preserve"/>
+            </w:r>
+          </w:p>
+        </w:tc>
+        <w:tc>
+          <w:tcPr>
+            <w:tcW w:w="5550" w:type="dxa"/>
+            <w:tcBorders>
+              <w:bottom w:val="single" w:sz="8" w:space="0" w:color="000000"/>
+            </w:tcBorders>
+            <w:vAlign w:val="center"/>
+          </w:tcPr>
+          <w:p>
+            <w:pPr>
+              <w:jc w:val="left"/>
+              <w:spacing w:before="0" w:after="0" w:line="240" w:lineRule="auto"/>
+            </w:pPr>
+            <w:r>
+              <w:rPr>
+                <w:rFonts w:ascii="Times New Roman" w:hAnsi="Times New Roman" w:eastAsia="Times New Roman"/>
+                <w:sz w:val="18"/>
+                <w:szCs w:val="18"/>
+              </w:rPr>
+              <w:t xml:space="preserve">Bài 10: Đồ chơi dân gian (tiết 1)</w:t>
+            </w:r>
+          </w:p>
+        </w:tc>
+        <w:tc>
+          <w:tcPr>
+            <w:tcW w:w="1150" w:type="dxa"/>
+            <w:tcBorders>
+              <w:bottom w:val="single" w:sz="8" w:space="0" w:color="000000"/>
+            </w:tcBorders>
+            <w:vAlign w:val="center"/>
+          </w:tcPr>
+          <w:p>
+            <w:pPr>
+              <w:jc w:val="center"/>
+              <w:spacing w:before="0" w:after="0" w:line="240" w:lineRule="auto"/>
+            </w:pPr>
+            <w:r>
+              <w:rPr>
+                <w:rFonts w:ascii="Times New Roman" w:hAnsi="Times New Roman" w:eastAsia="Times New Roman"/>
+                <w:sz w:val="18"/>
+                <w:szCs w:val="18"/>
+              </w:rPr>
+              <w:t xml:space="preserve">3 tiết</w:t>
+            </w:r>
+          </w:p>
+        </w:tc>
+        <w:tc>
+          <w:tcPr>
+            <w:tcW w:w="1100" w:type="dxa"/>
+            <w:tcBorders>
+              <w:bottom w:val="single" w:sz="8" w:space="0" w:color="000000"/>
+            </w:tcBorders>
+            <w:vAlign w:val="center"/>
+          </w:tcPr>
+          <w:p>
+            <w:pPr>
+              <w:jc w:val="center"/>
+              <w:spacing w:before="0" w:after="0" w:line="240" w:lineRule="auto"/>
+            </w:pPr>
+            <w:r>
+              <w:rPr>
+                <w:rFonts w:ascii="Times New Roman" w:hAnsi="Times New Roman" w:eastAsia="Times New Roman"/>
+                <w:sz w:val="18"/>
+                <w:szCs w:val="18"/>
+              </w:rPr>
+              <w:t xml:space="preserve">28</w:t>
+            </w:r>
+          </w:p>
+        </w:tc>
+        <w:tc>
+          <w:tcPr>
+            <w:tcW w:w="3100" w:type="dxa"/>
+            <w:tcBorders>
+              <w:bottom w:val="single" w:sz="8" w:space="0" w:color="000000"/>
+            </w:tcBorders>
+            <w:vAlign w:val="center"/>
+          </w:tcPr>
+          <w:p>
+            <w:pPr>
+              <w:jc w:val="left"/>
+              <w:spacing w:before="0" w:after="0" w:line="240" w:lineRule="auto"/>
+            </w:pPr>
+            <w:r>
+              <w:rPr>
+                <w:rFonts w:ascii="Times New Roman" w:hAnsi="Times New Roman" w:eastAsia="Times New Roman"/>
+                <w:i/>
+                <w:sz w:val="17"/>
+                <w:szCs w:val="17"/>
+              </w:rPr>
+              <w:t xml:space="preserve">GD STEM; NLS-ST: Tìm tư liệu, xem video hướng dẫn kĩ thuật; tạo sản phẩm và chụp/quay lại quá trình (có hướng dẫn).</w:t>
+            </w:r>
+          </w:p>
+        </w:tc>
+      </w:tr>
+      <w:tr>
+        <w:tc>
+          <w:tcPr>
+            <w:tcW w:w="750" w:type="dxa"/>
+            <w:tcBorders>
+              <w:bottom w:val="single" w:sz="8" w:space="0" w:color="000000"/>
+            </w:tcBorders>
+            <w:vAlign w:val="center"/>
+          </w:tcPr>
+          <w:p>
+            <w:pPr>
+              <w:jc w:val="center"/>
+              <w:spacing w:before="0" w:after="0" w:line="240" w:lineRule="auto"/>
+            </w:pPr>
+            <w:r>
+              <w:rPr>
+                <w:rFonts w:ascii="Times New Roman" w:hAnsi="Times New Roman" w:eastAsia="Times New Roman"/>
+                <w:sz w:val="18"/>
+                <w:szCs w:val="18"/>
+              </w:rPr>
+              <w:t xml:space="preserve">29</w:t>
+            </w:r>
+          </w:p>
+        </w:tc>
+        <w:tc>
+          <w:tcPr>
+            <w:tcW w:w="2750" w:type="dxa"/>
+            <w:tcBorders>
+              <w:bottom w:val="single" w:sz="8" w:space="0" w:color="000000"/>
+            </w:tcBorders>
+            <w:vAlign w:val="center"/>
+          </w:tcPr>
+          <w:p>
+            <w:pPr>
+              <w:jc w:val="left"/>
+              <w:spacing w:before="0" w:after="0" w:line="240" w:lineRule="auto"/>
+            </w:pPr>
+            <w:r>
+              <w:rPr>
+                <w:rFonts w:ascii="Times New Roman" w:hAnsi="Times New Roman" w:eastAsia="Times New Roman"/>
+                <w:sz w:val="18"/>
+                <w:szCs w:val="18"/>
+              </w:rPr>
+              <w:t xml:space="preserve"/>
+            </w:r>
+          </w:p>
+        </w:tc>
+        <w:tc>
+          <w:tcPr>
+            <w:tcW w:w="5550" w:type="dxa"/>
+            <w:tcBorders>
+              <w:bottom w:val="single" w:sz="8" w:space="0" w:color="000000"/>
+            </w:tcBorders>
+            <w:vAlign w:val="center"/>
+          </w:tcPr>
+          <w:p>
+            <w:pPr>
+              <w:jc w:val="left"/>
+              <w:spacing w:before="0" w:after="0" w:line="240" w:lineRule="auto"/>
+            </w:pPr>
+            <w:r>
+              <w:rPr>
+                <w:rFonts w:ascii="Times New Roman" w:hAnsi="Times New Roman" w:eastAsia="Times New Roman"/>
+                <w:sz w:val="18"/>
+                <w:szCs w:val="18"/>
+              </w:rPr>
+              <w:t xml:space="preserve">Bài 10: Đồ chơi dân gian (tiết 2)</w:t>
+            </w:r>
+          </w:p>
+        </w:tc>
+        <w:tc>
+          <w:tcPr>
+            <w:tcW w:w="1150" w:type="dxa"/>
+            <w:tcBorders>
+              <w:bottom w:val="single" w:sz="8" w:space="0" w:color="000000"/>
+            </w:tcBorders>
+            <w:vAlign w:val="center"/>
+          </w:tcPr>
+          <w:p>
+            <w:pPr>
+              <w:jc w:val="center"/>
+              <w:spacing w:before="0" w:after="0" w:line="240" w:lineRule="auto"/>
+            </w:pPr>
+            <w:r>
+              <w:rPr>
+                <w:rFonts w:ascii="Times New Roman" w:hAnsi="Times New Roman" w:eastAsia="Times New Roman"/>
+                <w:sz w:val="18"/>
+                <w:szCs w:val="18"/>
+              </w:rPr>
+              <w:t xml:space="preserve"/>
+            </w:r>
+          </w:p>
+        </w:tc>
+        <w:tc>
+          <w:tcPr>
+            <w:tcW w:w="1100" w:type="dxa"/>
+            <w:tcBorders>
+              <w:bottom w:val="single" w:sz="8" w:space="0" w:color="000000"/>
+            </w:tcBorders>
+            <w:vAlign w:val="center"/>
+          </w:tcPr>
+          <w:p>
+            <w:pPr>
+              <w:jc w:val="center"/>
+              <w:spacing w:before="0" w:after="0" w:line="240" w:lineRule="auto"/>
+            </w:pPr>
+            <w:r>
+              <w:rPr>
+                <w:rFonts w:ascii="Times New Roman" w:hAnsi="Times New Roman" w:eastAsia="Times New Roman"/>
+                <w:sz w:val="18"/>
+                <w:szCs w:val="18"/>
+              </w:rPr>
+              <w:t xml:space="preserve">29</w:t>
+            </w:r>
+          </w:p>
+        </w:tc>
+        <w:tc>
+          <w:tcPr>
+            <w:tcW w:w="3100" w:type="dxa"/>
+            <w:tcBorders>
+              <w:bottom w:val="single" w:sz="8" w:space="0" w:color="000000"/>
+            </w:tcBorders>
+            <w:vAlign w:val="center"/>
+          </w:tcPr>
+          <w:p>
+            <w:pPr>
+              <w:jc w:val="left"/>
+              <w:spacing w:before="0" w:after="0" w:line="240" w:lineRule="auto"/>
+            </w:pPr>
+            <w:r>
+              <w:rPr>
+                <w:rFonts w:ascii="Times New Roman" w:hAnsi="Times New Roman" w:eastAsia="Times New Roman"/>
+                <w:sz w:val="17"/>
+                <w:szCs w:val="17"/>
+              </w:rPr>
+              <w:t xml:space="preserve"/>
+            </w:r>
+          </w:p>
+        </w:tc>
+      </w:tr>
+      <w:tr>
+        <w:tc>
+          <w:tcPr>
+            <w:tcW w:w="750" w:type="dxa"/>
+            <w:tcBorders>
+              <w:bottom w:val="single" w:sz="8" w:space="0" w:color="000000"/>
+            </w:tcBorders>
+            <w:vAlign w:val="center"/>
+          </w:tcPr>
+          <w:p>
+            <w:pPr>
+              <w:jc w:val="center"/>
+              <w:spacing w:before="0" w:after="0" w:line="240" w:lineRule="auto"/>
+            </w:pPr>
+            <w:r>
+              <w:rPr>
+                <w:rFonts w:ascii="Times New Roman" w:hAnsi="Times New Roman" w:eastAsia="Times New Roman"/>
+                <w:sz w:val="18"/>
+                <w:szCs w:val="18"/>
+              </w:rPr>
+              <w:t xml:space="preserve">30</w:t>
+            </w:r>
+          </w:p>
+        </w:tc>
+        <w:tc>
+          <w:tcPr>
+            <w:tcW w:w="2750" w:type="dxa"/>
+            <w:tcBorders>
+              <w:bottom w:val="single" w:sz="8" w:space="0" w:color="000000"/>
+            </w:tcBorders>
+            <w:vAlign w:val="center"/>
+          </w:tcPr>
+          <w:p>
+            <w:pPr>
+              <w:jc w:val="left"/>
+              <w:spacing w:before="0" w:after="0" w:line="240" w:lineRule="auto"/>
+            </w:pPr>
+            <w:r>
+              <w:rPr>
+                <w:rFonts w:ascii="Times New Roman" w:hAnsi="Times New Roman" w:eastAsia="Times New Roman"/>
+                <w:sz w:val="18"/>
+                <w:szCs w:val="18"/>
+              </w:rPr>
+              <w:t xml:space="preserve"/>
+            </w:r>
+          </w:p>
+        </w:tc>
+        <w:tc>
+          <w:tcPr>
+            <w:tcW w:w="5550" w:type="dxa"/>
+            <w:tcBorders>
+              <w:bottom w:val="single" w:sz="8" w:space="0" w:color="000000"/>
+            </w:tcBorders>
+            <w:vAlign w:val="center"/>
+          </w:tcPr>
+          <w:p>
+            <w:pPr>
+              <w:jc w:val="left"/>
+              <w:spacing w:before="0" w:after="0" w:line="240" w:lineRule="auto"/>
+            </w:pPr>
+            <w:r>
+              <w:rPr>
+                <w:rFonts w:ascii="Times New Roman" w:hAnsi="Times New Roman" w:eastAsia="Times New Roman"/>
+                <w:sz w:val="18"/>
+                <w:szCs w:val="18"/>
+              </w:rPr>
+              <w:t xml:space="preserve">Bài 10: Đồ chơi dân gian (tiết 3)</w:t>
+            </w:r>
+          </w:p>
+        </w:tc>
+        <w:tc>
+          <w:tcPr>
+            <w:tcW w:w="1150" w:type="dxa"/>
+            <w:tcBorders>
+              <w:bottom w:val="single" w:sz="8" w:space="0" w:color="000000"/>
+            </w:tcBorders>
+            <w:vAlign w:val="center"/>
+          </w:tcPr>
+          <w:p>
+            <w:pPr>
+              <w:jc w:val="center"/>
+              <w:spacing w:before="0" w:after="0" w:line="240" w:lineRule="auto"/>
+            </w:pPr>
+            <w:r>
+              <w:rPr>
+                <w:rFonts w:ascii="Times New Roman" w:hAnsi="Times New Roman" w:eastAsia="Times New Roman"/>
+                <w:sz w:val="18"/>
+                <w:szCs w:val="18"/>
+              </w:rPr>
+              <w:t xml:space="preserve"/>
+            </w:r>
+          </w:p>
+        </w:tc>
+        <w:tc>
+          <w:tcPr>
+            <w:tcW w:w="1100" w:type="dxa"/>
+            <w:tcBorders>
+              <w:bottom w:val="single" w:sz="8" w:space="0" w:color="000000"/>
+            </w:tcBorders>
+            <w:vAlign w:val="center"/>
+          </w:tcPr>
+          <w:p>
+            <w:pPr>
+              <w:jc w:val="center"/>
+              <w:spacing w:before="0" w:after="0" w:line="240" w:lineRule="auto"/>
+            </w:pPr>
+            <w:r>
+              <w:rPr>
+                <w:rFonts w:ascii="Times New Roman" w:hAnsi="Times New Roman" w:eastAsia="Times New Roman"/>
+                <w:sz w:val="18"/>
+                <w:szCs w:val="18"/>
+              </w:rPr>
+              <w:t xml:space="preserve">30</w:t>
+            </w:r>
+          </w:p>
+        </w:tc>
+        <w:tc>
+          <w:tcPr>
+            <w:tcW w:w="3100" w:type="dxa"/>
+            <w:tcBorders>
+              <w:bottom w:val="single" w:sz="8" w:space="0" w:color="000000"/>
+            </w:tcBorders>
+            <w:vAlign w:val="center"/>
+          </w:tcPr>
+          <w:p>
+            <w:pPr>
+              <w:jc w:val="left"/>
+              <w:spacing w:before="0" w:after="0" w:line="240" w:lineRule="auto"/>
+            </w:pPr>
+            <w:r>
+              <w:rPr>
+                <w:rFonts w:ascii="Times New Roman" w:hAnsi="Times New Roman" w:eastAsia="Times New Roman"/>
+                <w:sz w:val="17"/>
+                <w:szCs w:val="17"/>
+              </w:rPr>
+              <w:t xml:space="preserve"/>
+            </w:r>
+          </w:p>
+        </w:tc>
+      </w:tr>
+      <w:tr>
+        <w:tc>
+          <w:tcPr>
+            <w:tcW w:w="750" w:type="dxa"/>
+            <w:tcBorders>
+              <w:bottom w:val="single" w:sz="8" w:space="0" w:color="000000"/>
+            </w:tcBorders>
+            <w:vAlign w:val="center"/>
+          </w:tcPr>
+          <w:p>
+            <w:pPr>
+              <w:jc w:val="center"/>
+              <w:spacing w:before="0" w:after="0" w:line="240" w:lineRule="auto"/>
+            </w:pPr>
+            <w:r>
+              <w:rPr>
+                <w:rFonts w:ascii="Times New Roman" w:hAnsi="Times New Roman" w:eastAsia="Times New Roman"/>
+                <w:sz w:val="18"/>
+                <w:szCs w:val="18"/>
+              </w:rPr>
+              <w:t xml:space="preserve">31</w:t>
+            </w:r>
+          </w:p>
+        </w:tc>
+        <w:tc>
+          <w:tcPr>
+            <w:tcW w:w="2750" w:type="dxa"/>
+            <w:tcBorders>
+              <w:bottom w:val="single" w:sz="8" w:space="0" w:color="000000"/>
+            </w:tcBorders>
+            <w:vAlign w:val="center"/>
+          </w:tcPr>
+          <w:p>
+            <w:pPr>
+              <w:jc w:val="left"/>
+              <w:spacing w:before="0" w:after="0" w:line="240" w:lineRule="auto"/>
+            </w:pPr>
+            <w:r>
+              <w:rPr>
+                <w:rFonts w:ascii="Times New Roman" w:hAnsi="Times New Roman" w:eastAsia="Times New Roman"/>
+                <w:sz w:val="18"/>
+                <w:szCs w:val="18"/>
+              </w:rPr>
+              <w:t xml:space="preserve"/>
+            </w:r>
+          </w:p>
+        </w:tc>
+        <w:tc>
+          <w:tcPr>
+            <w:tcW w:w="5550" w:type="dxa"/>
+            <w:tcBorders>
+              <w:bottom w:val="single" w:sz="8" w:space="0" w:color="000000"/>
+            </w:tcBorders>
+            <w:vAlign w:val="center"/>
+          </w:tcPr>
+          <w:p>
+            <w:pPr>
+              <w:jc w:val="left"/>
+              <w:spacing w:before="0" w:after="0" w:line="240" w:lineRule="auto"/>
+            </w:pPr>
+            <w:r>
+              <w:rPr>
+                <w:rFonts w:ascii="Times New Roman" w:hAnsi="Times New Roman" w:eastAsia="Times New Roman"/>
+                <w:sz w:val="18"/>
+                <w:szCs w:val="18"/>
+              </w:rPr>
+              <w:t xml:space="preserve">Bài 11: Làm đèn lồng</w:t>
+            </w:r>
+          </w:p>
+        </w:tc>
+        <w:tc>
+          <w:tcPr>
+            <w:tcW w:w="1150" w:type="dxa"/>
+            <w:tcBorders>
+              <w:bottom w:val="single" w:sz="8" w:space="0" w:color="000000"/>
+            </w:tcBorders>
+            <w:vAlign w:val="center"/>
+          </w:tcPr>
+          <w:p>
+            <w:pPr>
+              <w:jc w:val="center"/>
+              <w:spacing w:before="0" w:after="0" w:line="240" w:lineRule="auto"/>
+            </w:pPr>
+            <w:r>
+              <w:rPr>
+                <w:rFonts w:ascii="Times New Roman" w:hAnsi="Times New Roman" w:eastAsia="Times New Roman"/>
+                <w:sz w:val="18"/>
+                <w:szCs w:val="18"/>
+              </w:rPr>
+              <w:t xml:space="preserve">1 tiết</w:t>
+            </w:r>
+          </w:p>
+        </w:tc>
+        <w:tc>
+          <w:tcPr>
+            <w:tcW w:w="1100" w:type="dxa"/>
+            <w:tcBorders>
+              <w:bottom w:val="single" w:sz="8" w:space="0" w:color="000000"/>
+            </w:tcBorders>
+            <w:vAlign w:val="center"/>
+          </w:tcPr>
+          <w:p>
+            <w:pPr>
+              <w:jc w:val="center"/>
+              <w:spacing w:before="0" w:after="0" w:line="240" w:lineRule="auto"/>
+            </w:pPr>
+            <w:r>
+              <w:rPr>
+                <w:rFonts w:ascii="Times New Roman" w:hAnsi="Times New Roman" w:eastAsia="Times New Roman"/>
+                <w:sz w:val="18"/>
+                <w:szCs w:val="18"/>
+              </w:rPr>
+              <w:t xml:space="preserve">31</w:t>
+            </w:r>
+          </w:p>
+        </w:tc>
+        <w:tc>
+          <w:tcPr>
+            <w:tcW w:w="3100" w:type="dxa"/>
+            <w:tcBorders>
+              <w:bottom w:val="single" w:sz="8" w:space="0" w:color="000000"/>
+            </w:tcBorders>
+            <w:vAlign w:val="center"/>
+          </w:tcPr>
+          <w:p>
+            <w:pPr>
+              <w:jc w:val="left"/>
+              <w:spacing w:before="0" w:after="0" w:line="240" w:lineRule="auto"/>
+            </w:pPr>
+            <w:r>
+              <w:rPr>
+                <w:rFonts w:ascii="Times New Roman" w:hAnsi="Times New Roman" w:eastAsia="Times New Roman"/>
+                <w:i/>
+                <w:sz w:val="17"/>
+                <w:szCs w:val="17"/>
+              </w:rPr>
+              <w:t xml:space="preserve">GD STEM; NLS-ST: Tìm tư liệu, xem video hướng dẫn kĩ thuật; tạo sản phẩm và chụp/quay lại quá trình (có hướng dẫn).</w:t>
+            </w:r>
+          </w:p>
+        </w:tc>
+      </w:tr>
+      <w:tr>
+        <w:tc>
+          <w:tcPr>
+            <w:tcW w:w="750" w:type="dxa"/>
+            <w:tcBorders>
+              <w:bottom w:val="single" w:sz="8" w:space="0" w:color="000000"/>
+            </w:tcBorders>
+            <w:vAlign w:val="center"/>
+          </w:tcPr>
+          <w:p>
+            <w:pPr>
+              <w:jc w:val="center"/>
+              <w:spacing w:before="0" w:after="0" w:line="240" w:lineRule="auto"/>
+            </w:pPr>
+            <w:r>
+              <w:rPr>
+                <w:rFonts w:ascii="Times New Roman" w:hAnsi="Times New Roman" w:eastAsia="Times New Roman"/>
+                <w:sz w:val="18"/>
+                <w:szCs w:val="18"/>
+              </w:rPr>
+              <w:t xml:space="preserve">32</w:t>
+            </w:r>
+          </w:p>
+        </w:tc>
+        <w:tc>
+          <w:tcPr>
+            <w:tcW w:w="2750" w:type="dxa"/>
+            <w:tcBorders>
+              <w:bottom w:val="single" w:sz="8" w:space="0" w:color="000000"/>
+            </w:tcBorders>
+            <w:vAlign w:val="center"/>
+          </w:tcPr>
+          <w:p>
+            <w:pPr>
+              <w:jc w:val="left"/>
+              <w:spacing w:before="0" w:after="0" w:line="240" w:lineRule="auto"/>
+            </w:pPr>
+            <w:r>
+              <w:rPr>
+                <w:rFonts w:ascii="Times New Roman" w:hAnsi="Times New Roman" w:eastAsia="Times New Roman"/>
+                <w:sz w:val="18"/>
+                <w:szCs w:val="18"/>
+              </w:rPr>
+              <w:t xml:space="preserve"/>
+            </w:r>
+          </w:p>
+        </w:tc>
+        <w:tc>
+          <w:tcPr>
+            <w:tcW w:w="5550" w:type="dxa"/>
+            <w:tcBorders>
+              <w:bottom w:val="single" w:sz="8" w:space="0" w:color="000000"/>
+            </w:tcBorders>
+            <w:vAlign w:val="center"/>
+          </w:tcPr>
+          <w:p>
+            <w:pPr>
+              <w:jc w:val="left"/>
+              <w:spacing w:before="0" w:after="0" w:line="240" w:lineRule="auto"/>
+            </w:pPr>
+            <w:r>
+              <w:rPr>
+                <w:rFonts w:ascii="Times New Roman" w:hAnsi="Times New Roman" w:eastAsia="Times New Roman"/>
+                <w:sz w:val="18"/>
+                <w:szCs w:val="18"/>
+              </w:rPr>
+              <w:t xml:space="preserve">Bài 12: Làm chuồn chuồn thăng bằng (tiết 1)</w:t>
+            </w:r>
+          </w:p>
+        </w:tc>
+        <w:tc>
+          <w:tcPr>
+            <w:tcW w:w="1150" w:type="dxa"/>
+            <w:tcBorders>
+              <w:bottom w:val="single" w:sz="8" w:space="0" w:color="000000"/>
+            </w:tcBorders>
+            <w:vAlign w:val="center"/>
+          </w:tcPr>
+          <w:p>
+            <w:pPr>
+              <w:jc w:val="center"/>
+              <w:spacing w:before="0" w:after="0" w:line="240" w:lineRule="auto"/>
+            </w:pPr>
+            <w:r>
+              <w:rPr>
+                <w:rFonts w:ascii="Times New Roman" w:hAnsi="Times New Roman" w:eastAsia="Times New Roman"/>
+                <w:sz w:val="18"/>
+                <w:szCs w:val="18"/>
+              </w:rPr>
+              <w:t xml:space="preserve">2 tiết</w:t>
+            </w:r>
+          </w:p>
+        </w:tc>
+        <w:tc>
+          <w:tcPr>
+            <w:tcW w:w="1100" w:type="dxa"/>
+            <w:tcBorders>
+              <w:bottom w:val="single" w:sz="8" w:space="0" w:color="000000"/>
+            </w:tcBorders>
+            <w:vAlign w:val="center"/>
+          </w:tcPr>
+          <w:p>
+            <w:pPr>
+              <w:jc w:val="center"/>
+              <w:spacing w:before="0" w:after="0" w:line="240" w:lineRule="auto"/>
+            </w:pPr>
+            <w:r>
+              <w:rPr>
+                <w:rFonts w:ascii="Times New Roman" w:hAnsi="Times New Roman" w:eastAsia="Times New Roman"/>
+                <w:sz w:val="18"/>
+                <w:szCs w:val="18"/>
+              </w:rPr>
+              <w:t xml:space="preserve">32</w:t>
+            </w:r>
+          </w:p>
+        </w:tc>
+        <w:tc>
+          <w:tcPr>
+            <w:tcW w:w="3100" w:type="dxa"/>
+            <w:tcBorders>
+              <w:bottom w:val="single" w:sz="8" w:space="0" w:color="000000"/>
+            </w:tcBorders>
+            <w:vAlign w:val="center"/>
+          </w:tcPr>
+          <w:p>
+            <w:pPr>
+              <w:jc w:val="left"/>
+              <w:spacing w:before="0" w:after="0" w:line="240" w:lineRule="auto"/>
+            </w:pPr>
+            <w:r>
+              <w:rPr>
+                <w:rFonts w:ascii="Times New Roman" w:hAnsi="Times New Roman" w:eastAsia="Times New Roman"/>
+                <w:i/>
+                <w:sz w:val="17"/>
+                <w:szCs w:val="17"/>
+              </w:rPr>
+              <w:t xml:space="preserve">GD STEM; NLS-ST: Tìm tư liệu, xem video hướng dẫn kĩ thuật; tạo sản phẩm và chụp/quay lại quá trình (có hướng dẫn).</w:t>
+            </w:r>
+          </w:p>
+        </w:tc>
+      </w:tr>
+      <w:tr>
+        <w:tc>
+          <w:tcPr>
+            <w:tcW w:w="750" w:type="dxa"/>
+            <w:tcBorders>
+              <w:bottom w:val="single" w:sz="8" w:space="0" w:color="000000"/>
+            </w:tcBorders>
+            <w:vAlign w:val="center"/>
+          </w:tcPr>
+          <w:p>
+            <w:pPr>
+              <w:jc w:val="center"/>
+              <w:spacing w:before="0" w:after="0" w:line="240" w:lineRule="auto"/>
+            </w:pPr>
+            <w:r>
+              <w:rPr>
+                <w:rFonts w:ascii="Times New Roman" w:hAnsi="Times New Roman" w:eastAsia="Times New Roman"/>
+                <w:sz w:val="18"/>
+                <w:szCs w:val="18"/>
+              </w:rPr>
+              <w:t xml:space="preserve">33</w:t>
+            </w:r>
+          </w:p>
+        </w:tc>
+        <w:tc>
+          <w:tcPr>
+            <w:tcW w:w="2750" w:type="dxa"/>
+            <w:tcBorders>
+              <w:bottom w:val="single" w:sz="8" w:space="0" w:color="000000"/>
+            </w:tcBorders>
+            <w:vAlign w:val="center"/>
+          </w:tcPr>
+          <w:p>
+            <w:pPr>
+              <w:jc w:val="left"/>
+              <w:spacing w:before="0" w:after="0" w:line="240" w:lineRule="auto"/>
+            </w:pPr>
+            <w:r>
+              <w:rPr>
+                <w:rFonts w:ascii="Times New Roman" w:hAnsi="Times New Roman" w:eastAsia="Times New Roman"/>
+                <w:sz w:val="18"/>
+                <w:szCs w:val="18"/>
+              </w:rPr>
+              <w:t xml:space="preserve"/>
+            </w:r>
+          </w:p>
+        </w:tc>
+        <w:tc>
+          <w:tcPr>
+            <w:tcW w:w="5550" w:type="dxa"/>
+            <w:tcBorders>
+              <w:bottom w:val="single" w:sz="8" w:space="0" w:color="000000"/>
+            </w:tcBorders>
+            <w:vAlign w:val="center"/>
+          </w:tcPr>
+          <w:p>
+            <w:pPr>
+              <w:jc w:val="left"/>
+              <w:spacing w:before="0" w:after="0" w:line="240" w:lineRule="auto"/>
+            </w:pPr>
+            <w:r>
+              <w:rPr>
+                <w:rFonts w:ascii="Times New Roman" w:hAnsi="Times New Roman" w:eastAsia="Times New Roman"/>
+                <w:sz w:val="18"/>
+                <w:szCs w:val="18"/>
+              </w:rPr>
+              <w:t xml:space="preserve">Bài 12: Làm chuồn chuồn thăng bằng (tiết 2)</w:t>
+            </w:r>
+          </w:p>
+        </w:tc>
+        <w:tc>
+          <w:tcPr>
+            <w:tcW w:w="1150" w:type="dxa"/>
+            <w:tcBorders>
+              <w:bottom w:val="single" w:sz="8" w:space="0" w:color="000000"/>
+            </w:tcBorders>
+            <w:vAlign w:val="center"/>
+          </w:tcPr>
+          <w:p>
+            <w:pPr>
+              <w:jc w:val="center"/>
+              <w:spacing w:before="0" w:after="0" w:line="240" w:lineRule="auto"/>
+            </w:pPr>
+            <w:r>
+              <w:rPr>
+                <w:rFonts w:ascii="Times New Roman" w:hAnsi="Times New Roman" w:eastAsia="Times New Roman"/>
+                <w:sz w:val="18"/>
+                <w:szCs w:val="18"/>
+              </w:rPr>
+              <w:t xml:space="preserve"/>
+            </w:r>
+          </w:p>
+        </w:tc>
+        <w:tc>
+          <w:tcPr>
+            <w:tcW w:w="1100" w:type="dxa"/>
+            <w:tcBorders>
+              <w:bottom w:val="single" w:sz="8" w:space="0" w:color="000000"/>
+            </w:tcBorders>
+            <w:vAlign w:val="center"/>
+          </w:tcPr>
+          <w:p>
+            <w:pPr>
+              <w:jc w:val="center"/>
+              <w:spacing w:before="0" w:after="0" w:line="240" w:lineRule="auto"/>
+            </w:pPr>
+            <w:r>
+              <w:rPr>
+                <w:rFonts w:ascii="Times New Roman" w:hAnsi="Times New Roman" w:eastAsia="Times New Roman"/>
+                <w:sz w:val="18"/>
+                <w:szCs w:val="18"/>
+              </w:rPr>
+              <w:t xml:space="preserve">33</w:t>
+            </w:r>
+          </w:p>
+        </w:tc>
+        <w:tc>
+          <w:tcPr>
+            <w:tcW w:w="3100" w:type="dxa"/>
+            <w:tcBorders>
+              <w:bottom w:val="single" w:sz="8" w:space="0" w:color="000000"/>
+            </w:tcBorders>
+            <w:vAlign w:val="center"/>
+          </w:tcPr>
+          <w:p>
+            <w:pPr>
+              <w:jc w:val="left"/>
+              <w:spacing w:before="0" w:after="0" w:line="240" w:lineRule="auto"/>
+            </w:pPr>
+            <w:r>
+              <w:rPr>
+                <w:rFonts w:ascii="Times New Roman" w:hAnsi="Times New Roman" w:eastAsia="Times New Roman"/>
+                <w:sz w:val="17"/>
+                <w:szCs w:val="17"/>
+              </w:rPr>
+              <w:t xml:space="preserve"/>
+            </w:r>
+          </w:p>
+        </w:tc>
+      </w:tr>
+      <w:tr>
+        <w:tc>
+          <w:tcPr>
+            <w:tcW w:w="750" w:type="dxa"/>
+            <w:tcBorders>
+              <w:bottom w:val="single" w:sz="8" w:space="0" w:color="000000"/>
+            </w:tcBorders>
+            <w:vAlign w:val="center"/>
+          </w:tcPr>
+          <w:p>
+            <w:pPr>
+              <w:jc w:val="center"/>
+              <w:spacing w:before="0" w:after="0" w:line="240" w:lineRule="auto"/>
+            </w:pPr>
+            <w:r>
+              <w:rPr>
+                <w:rFonts w:ascii="Times New Roman" w:hAnsi="Times New Roman" w:eastAsia="Times New Roman"/>
+                <w:sz w:val="18"/>
+                <w:szCs w:val="18"/>
+              </w:rPr>
+              <w:t xml:space="preserve">34</w:t>
+            </w:r>
+          </w:p>
+        </w:tc>
+        <w:tc>
+          <w:tcPr>
+            <w:tcW w:w="2750" w:type="dxa"/>
+            <w:tcBorders>
+              <w:bottom w:val="single" w:sz="8" w:space="0" w:color="000000"/>
+            </w:tcBorders>
+            <w:vAlign w:val="center"/>
+          </w:tcPr>
+          <w:p>
+            <w:pPr>
+              <w:jc w:val="left"/>
+              <w:spacing w:before="0" w:after="0" w:line="240" w:lineRule="auto"/>
+            </w:pPr>
+            <w:r>
+              <w:rPr>
+                <w:rFonts w:ascii="Times New Roman" w:hAnsi="Times New Roman" w:eastAsia="Times New Roman"/>
+                <w:sz w:val="18"/>
+                <w:szCs w:val="18"/>
+              </w:rPr>
+              <w:t xml:space="preserve"/>
+            </w:r>
+          </w:p>
+        </w:tc>
+        <w:tc>
+          <w:tcPr>
+            <w:tcW w:w="5550" w:type="dxa"/>
+            <w:tcBorders>
+              <w:bottom w:val="single" w:sz="8" w:space="0" w:color="000000"/>
+            </w:tcBorders>
+            <w:vAlign w:val="center"/>
+          </w:tcPr>
+          <w:p>
+            <w:pPr>
+              <w:jc w:val="left"/>
+              <w:spacing w:before="0" w:after="0" w:line="240" w:lineRule="auto"/>
+            </w:pPr>
+            <w:r>
+              <w:rPr>
+                <w:rFonts w:ascii="Times New Roman" w:hAnsi="Times New Roman" w:eastAsia="Times New Roman"/>
+                <w:sz w:val="18"/>
+                <w:szCs w:val="18"/>
+              </w:rPr>
+              <w:t xml:space="preserve">Ôn tập cuối năm</w:t>
+            </w:r>
+          </w:p>
+        </w:tc>
+        <w:tc>
+          <w:tcPr>
+            <w:tcW w:w="1150" w:type="dxa"/>
+            <w:tcBorders>
+              <w:bottom w:val="single" w:sz="8" w:space="0" w:color="000000"/>
+            </w:tcBorders>
+            <w:vAlign w:val="center"/>
+          </w:tcPr>
+          <w:p>
+            <w:pPr>
+              <w:jc w:val="center"/>
+              <w:spacing w:before="0" w:after="0" w:line="240" w:lineRule="auto"/>
+            </w:pPr>
+            <w:r>
+              <w:rPr>
+                <w:rFonts w:ascii="Times New Roman" w:hAnsi="Times New Roman" w:eastAsia="Times New Roman"/>
+                <w:sz w:val="18"/>
+                <w:szCs w:val="18"/>
+              </w:rPr>
+              <w:t xml:space="preserve">1 tiết</w:t>
+            </w:r>
+          </w:p>
+        </w:tc>
+        <w:tc>
+          <w:tcPr>
+            <w:tcW w:w="1100" w:type="dxa"/>
+            <w:tcBorders>
+              <w:bottom w:val="single" w:sz="8" w:space="0" w:color="000000"/>
+            </w:tcBorders>
+            <w:vAlign w:val="center"/>
+          </w:tcPr>
+          <w:p>
+            <w:pPr>
+              <w:jc w:val="center"/>
+              <w:spacing w:before="0" w:after="0" w:line="240" w:lineRule="auto"/>
+            </w:pPr>
+            <w:r>
+              <w:rPr>
+                <w:rFonts w:ascii="Times New Roman" w:hAnsi="Times New Roman" w:eastAsia="Times New Roman"/>
+                <w:sz w:val="18"/>
+                <w:szCs w:val="18"/>
+              </w:rPr>
+              <w:t xml:space="preserve">34</w:t>
+            </w:r>
+          </w:p>
+        </w:tc>
+        <w:tc>
+          <w:tcPr>
+            <w:tcW w:w="3100" w:type="dxa"/>
+            <w:tcBorders>
+              <w:bottom w:val="single" w:sz="8" w:space="0" w:color="000000"/>
+            </w:tcBorders>
+            <w:vAlign w:val="center"/>
+          </w:tcPr>
+          <w:p>
+            <w:pPr>
+              <w:jc w:val="left"/>
+              <w:spacing w:before="0" w:after="0" w:line="240" w:lineRule="auto"/>
+            </w:pPr>
+            <w:r>
+              <w:rPr>
+                <w:rFonts w:ascii="Times New Roman" w:hAnsi="Times New Roman" w:eastAsia="Times New Roman"/>
+                <w:sz w:val="17"/>
+                <w:szCs w:val="17"/>
+              </w:rPr>
+              <w:t xml:space="preserve"/>
+            </w:r>
+          </w:p>
+        </w:tc>
+      </w:tr>
+      <w:tr>
+        <w:tc>
+          <w:tcPr>
+            <w:tcW w:w="750" w:type="dxa"/>
+            <w:tcBorders>
+              <w:bottom w:val="single" w:sz="8" w:space="0" w:color="000000"/>
+            </w:tcBorders>
+            <w:vAlign w:val="center"/>
+          </w:tcPr>
+          <w:p>
+            <w:pPr>
+              <w:jc w:val="center"/>
+              <w:spacing w:before="0" w:after="0" w:line="240" w:lineRule="auto"/>
+            </w:pPr>
+            <w:r>
+              <w:rPr>
+                <w:rFonts w:ascii="Times New Roman" w:hAnsi="Times New Roman" w:eastAsia="Times New Roman"/>
+                <w:sz w:val="18"/>
+                <w:szCs w:val="18"/>
+              </w:rPr>
               <w:t xml:space="preserve">35</w:t>
             </w:r>
           </w:p>
@@ -2520,7 +5406,7 @@
                 <w:sz w:val="18"/>
                 <w:szCs w:val="18"/>
               </w:rPr>
-              <w:t xml:space="preserve">16</w:t>
+              <w:t xml:space="preserve">35</w:t>
             </w:r>
           </w:p>
         </w:tc>
@@ -2966,7 +5852,7 @@
           <w:sz w:val="18"/>
           <w:szCs w:val="18"/>
         </w:rPr>
-        <w:t xml:space="preserve">Tổng số tiết theo kế hoạch: 16 tiết. Cấu trúc bài học/hoạt động được xây dựng từ Kế hoạch bài dạy môn Công nghệ 4 đã chuẩn hoá trong kho giáo án số (bộ Kết nối tri thức với cuộc sống). Một số tuần/học kì khuyết tiết do nguồn giáo án gốc chưa đủ — nhà trường, giáo viên bổ sung theo phân phối chương trình thực tế.</w:t>
+        <w:t xml:space="preserve">Tổng số tiết theo kế hoạch: 35 tiết. Cấu trúc bài học/hoạt động được xây dựng từ Kế hoạch bài dạy môn Công nghệ 4 đã chuẩn hoá trong kho giáo án số (bộ Kết nối tri thức với cuộc sống). Một số tuần/học kì khuyết tiết do nguồn giáo án gốc chưa đủ — nhà trường, giáo viên bổ sung theo phân phối chương trình thực tế.</w:t>
       </w:r>
     </w:p>
     <w:tbl>

</xml_diff>